<commit_message>
docs: agregar enlace al CV en HTML en el PDF descargable y sincronizar documentos
</commit_message>
<xml_diff>
--- a/CV_Ruben_Barrios_Analista_De_Datos.docx
+++ b/CV_Ruben_Barrios_Analista_De_Datos.docx
@@ -220,6 +220,31 @@
             <w:lang w:val="en-US"/>
           </w:rPr>
           <w:t>-bigdata</w:t>
+        </w:r>
+      </w:hyperlink>
+    </w:p>
+    <w:p>
+      <w:pPr>
+        <w:spacing w:after="30"/>
+        <w:jc w:val="center"/>
+        <w:rPr>
+          <w:lang w:val="es-ES"/>
+        </w:rPr>
+      </w:pPr>
+      <w:r>
+        <w:rPr>
+          <w:lang w:val="es-ES"/>
+        </w:rPr>
+        <w:t xml:space="preserve">CV Web Interactivo (HTML): </w:t>
+      </w:r>
+      <w:hyperlink r:id="rId10" w:history="1">
+        <w:r>
+          <w:rPr>
+            <w:color w:val="1F4E79"/>
+            <w:u w:val="single"/>
+            <w:lang w:val="es-ES"/>
+          </w:rPr>
+          <w:t>https://rubenbarrios-bigdata.github.io/cv-ejecutivo-inteligente/</w:t>
         </w:r>
       </w:hyperlink>
     </w:p>

</xml_diff>

<commit_message>
fix(cv): ajustar CV digital, expandir nombres bancarios, actualizar descripciones técnicas y formación en curso
</commit_message>
<xml_diff>
--- a/CV_Ruben_Barrios_Analista_De_Datos.docx
+++ b/CV_Ruben_Barrios_Analista_De_Datos.docx
@@ -57,7 +57,7 @@
           <w:color w:val="2B6CB0"/>
           <w:sz w:val="18"/>
         </w:rPr>
-        <w:t xml:space="preserve">LinkedIn: linkedin.com/in/ruben-barrios-1430712ab | GitHub: github.com/rubenbarrios-bigdata | Portafolio: rubenbarrios-bigdata.github.io/cv-ejecutivo-inteligente/</w:t>
+        <w:t xml:space="preserve">LinkedIn: linkedin.com/in/ruben-barrios-1430712ab | GitHub: github.com/rubenbarrios-bigdata | CV Digital: rubenbarrios-bigdata.github.io/cv-ejecutivo-inteligente/</w:t>
       </w:r>
     </w:p>
     <w:p>
@@ -106,7 +106,7 @@
           <w:color w:val="1A202C"/>
           <w:sz w:val="19"/>
         </w:rPr>
-        <w:t xml:space="preserve">Power BI (DAX, modelado estrella)</w:t>
+        <w:t xml:space="preserve">Power BI (DAX)</w:t>
       </w:r>
       <w:r>
         <w:rPr>
@@ -244,7 +244,7 @@
           <w:color w:val="1A202C"/>
           <w:sz w:val="19"/>
         </w:rPr>
-        <w:t xml:space="preserve"> Power BI (DAX avanzado, Power Query, modelado estrella, PBIP), SQL (MySQL, PostgreSQL: queries complejas, subconsultas, window functions), Python (pandas, NumPy, Matplotlib, Colab, VSCode), Excel avanzado (Power Pivot, macros).</w:t>
+        <w:t xml:space="preserve"> Power BI (DAX avanzado, Power Query, modelado dimensional, PBIP), SQL (MySQL, PostgreSQL: queries complejas, subconsultas, agregaciones), Python (pandas, NumPy, Matplotlib, Colab, VSCode), Excel avanzado (tablas dinámicas, fórmulas complejas).</w:t>
       </w:r>
     </w:p>
     <w:p>
@@ -275,7 +275,7 @@
           <w:color w:val="1A202C"/>
           <w:sz w:val="19"/>
         </w:rPr>
-        <w:t xml:space="preserve"> Looker Studio, Google Analytics 4 (GA4), Google Tag Manager (GTM), Supabase, Firebase, BigQuery, diseño de KPIs ejecutivos, análisis de retención, engagement, funnel y churn.</w:t>
+        <w:t xml:space="preserve"> Looker Studio, Google Analytics 4 (GA4), Google Tag Manager (GTM), Supabase, Firebase, BigQuery, diseño de KPIs ejecutivos, análisis de retención, engagement, funnel y conversión.</w:t>
       </w:r>
     </w:p>
     <w:p>
@@ -911,7 +911,7 @@
           <w:color w:val="2B6CB0"/>
           <w:sz w:val="19"/>
         </w:rPr>
-        <w:t xml:space="preserve">Especialista de Comercio Exterior / Analista Financiero y Operaciones (BFC, Banco Exterior, BVC)</w:t>
+        <w:t xml:space="preserve">Especialista de Comercio Exterior / Analista Financiero y Operaciones — BFC Banco Fondo Común, Banco Exterior, Banco Venezolano de Crédito</w:t>
       </w:r>
     </w:p>
     <w:p>
@@ -1083,7 +1083,7 @@
           <w:color w:val="1A202C"/>
           <w:sz w:val="18"/>
         </w:rPr>
-        <w:t xml:space="preserve"> Tablero interactivo para optimización de operaciones de servicio al cliente: seguimiento de volumen de tickets, tiempos de respuesta, SLA de resolución y CSAT con modelado estrella y medidas DAX. (github.com/rubenbarrios-bigdata/dashboard-atencion-al-cliente)</w:t>
+        <w:t xml:space="preserve"> Tablero interactivo para optimización de operaciones de servicio al cliente: seguimiento de volumen de tickets, tiempos de primera respuesta, SLA de resolución y métricas operativas con medidas y cálculos en DAX. (github.com/rubenbarrios-bigdata/dashboard-atencion-al-cliente)</w:t>
       </w:r>
     </w:p>
     <w:p>
@@ -1145,7 +1145,7 @@
           <w:color w:val="1A202C"/>
           <w:sz w:val="18"/>
         </w:rPr>
-        <w:t xml:space="preserve"> Análisis transaccional sobre datasets relacionales reales empleando subqueries, JOINs complejos, CTEs y funciones de ventana en SQL para segmentación de clientes. (github.com/rubenbarrios-bigdata/proyecto-sql-orders)</w:t>
+        <w:t xml:space="preserve"> Análisis exploratorio y transaccional sobre datasets de ventas reales en MySQL empleando subqueries, agrupaciones y funciones de agregación para evaluación de métricas comerciales y márgenes de rentabilidad. (github.com/rubenbarrios-bigdata/proyecto-sql-orders)</w:t>
       </w:r>
     </w:p>
     <w:p>
@@ -1261,6 +1261,68 @@
           <w:color w:val="1A202C"/>
           <w:sz w:val="18"/>
         </w:rPr>
+        <w:t xml:space="preserve">Business Intelligence (BI Consulting)</w:t>
+      </w:r>
+      <w:r>
+        <w:rPr>
+          <w:rFonts w:ascii="Calibri" w:hAnsi="Calibri"/>
+          <w:color w:val="1A202C"/>
+          <w:sz w:val="18"/>
+        </w:rPr>
+        <w:t xml:space="preserve"> — En curso (Ruta formativa oficial hacia Analista de Datos)</w:t>
+      </w:r>
+    </w:p>
+    <w:p>
+      <w:pPr>
+        <w:spacing w:before="0" w:after="20"/>
+        <w:ind w:left="360" w:hanging="240"/>
+      </w:pPr>
+      <w:r>
+        <w:rPr>
+          <w:rFonts w:ascii="Calibri" w:hAnsi="Calibri"/>
+          <w:color w:val="1A202C"/>
+          <w:sz w:val="18"/>
+        </w:rPr>
+        <w:t xml:space="preserve">• </w:t>
+      </w:r>
+      <w:r>
+        <w:rPr>
+          <w:rFonts w:ascii="Calibri" w:hAnsi="Calibri"/>
+          <w:b/>
+          <w:color w:val="1A202C"/>
+          <w:sz w:val="18"/>
+        </w:rPr>
+        <w:t xml:space="preserve">Power BI DevOps: PBIP, Git, CI/CD y Microsoft Fabric</w:t>
+      </w:r>
+      <w:r>
+        <w:rPr>
+          <w:rFonts w:ascii="Calibri" w:hAnsi="Calibri"/>
+          <w:color w:val="1A202C"/>
+          <w:sz w:val="18"/>
+        </w:rPr>
+        <w:t xml:space="preserve"> — En curso — Udemy</w:t>
+      </w:r>
+    </w:p>
+    <w:p>
+      <w:pPr>
+        <w:spacing w:before="0" w:after="20"/>
+        <w:ind w:left="360" w:hanging="240"/>
+      </w:pPr>
+      <w:r>
+        <w:rPr>
+          <w:rFonts w:ascii="Calibri" w:hAnsi="Calibri"/>
+          <w:color w:val="1A202C"/>
+          <w:sz w:val="18"/>
+        </w:rPr>
+        <w:t xml:space="preserve">• </w:t>
+      </w:r>
+      <w:r>
+        <w:rPr>
+          <w:rFonts w:ascii="Calibri" w:hAnsi="Calibri"/>
+          <w:b/>
+          <w:color w:val="1A202C"/>
+          <w:sz w:val="18"/>
+        </w:rPr>
         <w:t xml:space="preserve">Licenciatura en Administración de Recursos Materiales y Financieros</w:t>
       </w:r>
       <w:r>
@@ -1317,7 +1379,7 @@
           <w:color w:val="1A365D"/>
           <w:sz w:val="24"/>
         </w:rPr>
-        <w:t>CERTIFICACIONES TÉCNICAS</w:t>
+        <w:t>CERTIFICADOS EXTRACURRICULARES</w:t>
       </w:r>
     </w:p>
     <w:p>
@@ -1340,15 +1402,15 @@
           <w:color w:val="1A202C"/>
           <w:sz w:val="18"/>
         </w:rPr>
-        <w:t xml:space="preserve">Power BI DevOps: PBIP, Git, CI/CD y Microsoft Fabric</w:t>
-      </w:r>
-      <w:r>
-        <w:rPr>
-          <w:rFonts w:ascii="Calibri" w:hAnsi="Calibri"/>
-          <w:color w:val="1A202C"/>
-          <w:sz w:val="18"/>
-        </w:rPr>
-        <w:t xml:space="preserve"> | Daxus Latam</w:t>
+        <w:t xml:space="preserve">Analítica Digital: Google Tag Manager, Google Analytics 4 y Data Studio</w:t>
+      </w:r>
+      <w:r>
+        <w:rPr>
+          <w:rFonts w:ascii="Calibri" w:hAnsi="Calibri"/>
+          <w:color w:val="1A202C"/>
+          <w:sz w:val="18"/>
+        </w:rPr>
+        <w:t xml:space="preserve"> | Analytics Way</w:t>
       </w:r>
     </w:p>
     <w:p>
@@ -1371,15 +1433,15 @@
           <w:color w:val="1A202C"/>
           <w:sz w:val="18"/>
         </w:rPr>
-        <w:t xml:space="preserve">Analítica Digital: Google Tag Manager, Google Analytics 4 y Data Studio</w:t>
-      </w:r>
-      <w:r>
-        <w:rPr>
-          <w:rFonts w:ascii="Calibri" w:hAnsi="Calibri"/>
-          <w:color w:val="1A202C"/>
-          <w:sz w:val="18"/>
-        </w:rPr>
-        <w:t xml:space="preserve"> | Capacitación Especializada</w:t>
+        <w:t xml:space="preserve">Análisis de Datos: Excel, Power BI, SQL y Python</w:t>
+      </w:r>
+      <w:r>
+        <w:rPr>
+          <w:rFonts w:ascii="Calibri" w:hAnsi="Calibri"/>
+          <w:color w:val="1A202C"/>
+          <w:sz w:val="18"/>
+        </w:rPr>
+        <w:t xml:space="preserve"> | Datax</w:t>
       </w:r>
     </w:p>
     <w:p>
@@ -1402,15 +1464,15 @@
           <w:color w:val="1A202C"/>
           <w:sz w:val="18"/>
         </w:rPr>
-        <w:t xml:space="preserve">Análisis de Datos: Excel, Power BI, SQL y Python</w:t>
-      </w:r>
-      <w:r>
-        <w:rPr>
-          <w:rFonts w:ascii="Calibri" w:hAnsi="Calibri"/>
-          <w:color w:val="1A202C"/>
-          <w:sz w:val="18"/>
-        </w:rPr>
-        <w:t xml:space="preserve"> | Datax</w:t>
+        <w:t xml:space="preserve">Fundamentos de Inteligencia Artificial (Artificial Intelligence Fundamentals)</w:t>
+      </w:r>
+      <w:r>
+        <w:rPr>
+          <w:rFonts w:ascii="Calibri" w:hAnsi="Calibri"/>
+          <w:color w:val="1A202C"/>
+          <w:sz w:val="18"/>
+        </w:rPr>
+        <w:t xml:space="preserve"> | IBM SkillsBuild</w:t>
       </w:r>
     </w:p>
     <w:p>
@@ -1433,37 +1495,6 @@
           <w:color w:val="1A202C"/>
           <w:sz w:val="18"/>
         </w:rPr>
-        <w:t xml:space="preserve">Fundamentos de Inteligencia Artificial (Artificial Intelligence Fundamentals)</w:t>
-      </w:r>
-      <w:r>
-        <w:rPr>
-          <w:rFonts w:ascii="Calibri" w:hAnsi="Calibri"/>
-          <w:color w:val="1A202C"/>
-          <w:sz w:val="18"/>
-        </w:rPr>
-        <w:t xml:space="preserve"> | IBM SkillsBuild</w:t>
-      </w:r>
-    </w:p>
-    <w:p>
-      <w:pPr>
-        <w:spacing w:before="0" w:after="15"/>
-        <w:ind w:left="360" w:hanging="240"/>
-      </w:pPr>
-      <w:r>
-        <w:rPr>
-          <w:rFonts w:ascii="Calibri" w:hAnsi="Calibri"/>
-          <w:color w:val="1A202C"/>
-          <w:sz w:val="18"/>
-        </w:rPr>
-        <w:t xml:space="preserve">• </w:t>
-      </w:r>
-      <w:r>
-        <w:rPr>
-          <w:rFonts w:ascii="Calibri" w:hAnsi="Calibri"/>
-          <w:b/>
-          <w:color w:val="1A202C"/>
-          <w:sz w:val="18"/>
-        </w:rPr>
         <w:t xml:space="preserve">Iniciación a la Programación con Python</w:t>
       </w:r>
       <w:r>
@@ -1472,7 +1503,7 @@
           <w:color w:val="1A202C"/>
           <w:sz w:val="18"/>
         </w:rPr>
-        <w:t xml:space="preserve"> | Educación IT</w:t>
+        <w:t xml:space="preserve"> | Talento Tech — Ministerio de Educación GCBA</w:t>
       </w:r>
     </w:p>
     <w:p>

</xml_diff>

<commit_message>
fix(cv): actualizar entidad Ministerio de Educacion GCBA en tecnicatura y detalle cuatrimestre en BI Consulting
</commit_message>
<xml_diff>
--- a/CV_Ruben_Barrios_Analista_De_Datos.docx
+++ b/CV_Ruben_Barrios_Analista_De_Datos.docx
@@ -1238,7 +1238,7 @@
           <w:color w:val="1A202C"/>
           <w:sz w:val="18"/>
         </w:rPr>
-        <w:t xml:space="preserve"> — En curso (Primer Año) — Instituto de Formación Técnica Superior | Buenos Aires, Argentina</w:t>
+        <w:t xml:space="preserve"> — En curso (Primer Año) — Instituto de Formación Técnica Superior | Ministerio de Educación GCBA</w:t>
       </w:r>
     </w:p>
     <w:p>
@@ -1269,7 +1269,7 @@
           <w:color w:val="1A202C"/>
           <w:sz w:val="18"/>
         </w:rPr>
-        <w:t xml:space="preserve"> — En curso (Ruta formativa oficial hacia Analista de Datos)</w:t>
+        <w:t xml:space="preserve"> — En curso (Segundo cuatrimestre de cuatro, ruta formativa oficial hacia Análisis de Datos) — Talento Tech | Ministerio de Educación GCBA</w:t>
       </w:r>
     </w:p>
     <w:p>

</xml_diff>

<commit_message>
feat(cv): actualizar Perfil Profesional y Resumen Profesional en PDF y web
</commit_message>
<xml_diff>
--- a/CV_Ruben_Barrios_Analista_De_Datos.docx
+++ b/CV_Ruben_Barrios_Analista_De_Datos.docx
@@ -97,24 +97,24 @@
           <w:color w:val="1A202C"/>
           <w:sz w:val="19"/>
         </w:rPr>
-        <w:t xml:space="preserve"> con experiencia demostrada en análisis de métricas de fraude, logística y e-commerce, y más de 15 años de sólida trayectoria previa en el sector bancario y financiero internacional. Especializado en transformar requerimientos de negocio en soluciones analíticas de alto impacto mediante el diseño de dashboards en </w:t>
-      </w:r>
-      <w:r>
-        <w:rPr>
-          <w:rFonts w:ascii="Calibri" w:hAnsi="Calibri"/>
-          <w:b/>
-          <w:color w:val="1A202C"/>
-          <w:sz w:val="19"/>
-        </w:rPr>
-        <w:t xml:space="preserve">Power BI (DAX)</w:t>
-      </w:r>
-      <w:r>
-        <w:rPr>
-          <w:rFonts w:ascii="Calibri" w:hAnsi="Calibri"/>
-          <w:color w:val="1A202C"/>
-          <w:sz w:val="19"/>
-        </w:rPr>
-        <w:t xml:space="preserve">, consultas avanzadas en </w:t>
+        <w:t xml:space="preserve"> con experiencia demostrada en análisis de métricas de fraude, logística y e-commerce, y más de 15 años de sólida trayectoria previa en el sector bancario y financiero internacional. Con enfoque resolutivo orientado a transformar requerimientos de negocio en soluciones analíticas de alto impacto mediante el diseño de dashboards en </w:t>
+      </w:r>
+      <w:r>
+        <w:rPr>
+          <w:rFonts w:ascii="Calibri" w:hAnsi="Calibri"/>
+          <w:b/>
+          <w:color w:val="1A202C"/>
+          <w:sz w:val="19"/>
+        </w:rPr>
+        <w:t xml:space="preserve">Excel, Power BI y Data Studio</w:t>
+      </w:r>
+      <w:r>
+        <w:rPr>
+          <w:rFonts w:ascii="Calibri" w:hAnsi="Calibri"/>
+          <w:color w:val="1A202C"/>
+          <w:sz w:val="19"/>
+        </w:rPr>
+        <w:t xml:space="preserve">, consultas </w:t>
       </w:r>
       <w:r>
         <w:rPr>
@@ -196,7 +196,7 @@
           <w:color w:val="1A202C"/>
           <w:sz w:val="19"/>
         </w:rPr>
-        <w:t xml:space="preserve"> en operaciones de alto volumen mediante sistemas de monitoreo en tiempo real. Perfil analítico orientado a la toma de decisiones basada en evidencia, conciliaciones complejas y trabajo multidisciplinario con equipos de Producto, Backend y Operaciones.</w:t>
+        <w:t xml:space="preserve"> en operaciones de alto volumen mediante el monitoreo contínuo de métricas. Perfil analítico orientado a la toma de decisiones basada en evidencia, y trabajo multidisciplinario con equipos de Producto, Backend y Operaciones.</w:t>
       </w:r>
     </w:p>
     <w:p>

</xml_diff>

<commit_message>
feat(cv): actualizar resumen profesional con enfoque en logistica last-mile, finanzas y bigquery
</commit_message>
<xml_diff>
--- a/CV_Ruben_Barrios_Analista_De_Datos.docx
+++ b/CV_Ruben_Barrios_Analista_De_Datos.docx
@@ -97,16 +97,16 @@
           <w:color w:val="1A202C"/>
           <w:sz w:val="19"/>
         </w:rPr>
-        <w:t xml:space="preserve"> con experiencia demostrada en análisis de métricas de fraude, logística y e-commerce, y más de 15 años de sólida trayectoria previa en el sector bancario y financiero internacional. Con enfoque resolutivo orientado a transformar requerimientos de negocio en soluciones analíticas de alto impacto mediante el diseño de dashboards en </w:t>
-      </w:r>
-      <w:r>
-        <w:rPr>
-          <w:rFonts w:ascii="Calibri" w:hAnsi="Calibri"/>
-          <w:b/>
-          <w:color w:val="1A202C"/>
-          <w:sz w:val="19"/>
-        </w:rPr>
-        <w:t xml:space="preserve">Excel, Power BI y Data Studio</w:t>
+        <w:t xml:space="preserve"> con experiencia comprobada en análisis de métricas de fraude en logística para e-commerce y distribución de última milla (Last-Mile Fulfillment), complementada por más de 15 años de sólida trayectoria en el sector bancario, negocios internacionales y finanzas corporativas. Hoy combino esa visión estratégica con un enfoque resolutivo orientado a transformar requerimientos de negocio en soluciones analíticas de alto impacto mediante el diseño de dashboards en </w:t>
+      </w:r>
+      <w:r>
+        <w:rPr>
+          <w:rFonts w:ascii="Calibri" w:hAnsi="Calibri"/>
+          <w:b/>
+          <w:color w:val="1A202C"/>
+          <w:sz w:val="19"/>
+        </w:rPr>
+        <w:t xml:space="preserve">Excel y Power BI</w:t>
       </w:r>
       <w:r>
         <w:rPr>
@@ -157,7 +157,7 @@
           <w:color w:val="1A202C"/>
           <w:sz w:val="19"/>
         </w:rPr>
-        <w:t xml:space="preserve">GTM, GA4, Supabase y Looker Studio</w:t>
+        <w:t xml:space="preserve">GTM, GA4, BigQuery y Data Studio</w:t>
       </w:r>
       <w:r>
         <w:rPr>
@@ -196,7 +196,7 @@
           <w:color w:val="1A202C"/>
           <w:sz w:val="19"/>
         </w:rPr>
-        <w:t xml:space="preserve"> en operaciones de alto volumen mediante el monitoreo contínuo de métricas. Perfil analítico orientado a la toma de decisiones basada en evidencia, y trabajo multidisciplinario con equipos de Producto, Backend y Operaciones.</w:t>
+        <w:t xml:space="preserve"> en operaciones de alto volumen mediante el monitoreo continuo de métricas. Perfil analítico orientado a la toma de decisiones basada en evidencia y trabajo multidisciplinario con equipos de Producto, Backend y Operaciones.</w:t>
       </w:r>
     </w:p>
     <w:p>

</xml_diff>

<commit_message>
feat(cv): priorizar analisis de patrones SQL e incorporar Business Intelligence a dashboards
</commit_message>
<xml_diff>
--- a/CV_Ruben_Barrios_Analista_De_Datos.docx
+++ b/CV_Ruben_Barrios_Analista_De_Datos.docx
@@ -756,7 +756,38 @@
           <w:color w:val="1A202C"/>
           <w:sz w:val="18"/>
         </w:rPr>
-        <w:t xml:space="preserve">Monitoreo y tableros de control en tiempo real:</w:t>
+        <w:t xml:space="preserve">Detección de patrones anómalos y análisis SQL:</w:t>
+      </w:r>
+      <w:r>
+        <w:rPr>
+          <w:rFonts w:ascii="Calibri" w:hAnsi="Calibri"/>
+          <w:color w:val="1A202C"/>
+          <w:sz w:val="18"/>
+        </w:rPr>
+        <w:t xml:space="preserve"> Extracción y limpieza de datos operativos con consultas analíticas en SQL y reporting automatizado para identificar desvíos sistemáticos y mitigar pérdidas financieras.</w:t>
+      </w:r>
+    </w:p>
+    <w:p>
+      <w:pPr>
+        <w:spacing w:before="0" w:after="20"/>
+        <w:ind w:left="360" w:hanging="240"/>
+      </w:pPr>
+      <w:r>
+        <w:rPr>
+          <w:rFonts w:ascii="Calibri" w:hAnsi="Calibri"/>
+          <w:color w:val="1A202C"/>
+          <w:sz w:val="18"/>
+        </w:rPr>
+        <w:t xml:space="preserve">• </w:t>
+      </w:r>
+      <w:r>
+        <w:rPr>
+          <w:rFonts w:ascii="Calibri" w:hAnsi="Calibri"/>
+          <w:b/>
+          <w:color w:val="1A202C"/>
+          <w:sz w:val="18"/>
+        </w:rPr>
+        <w:t xml:space="preserve">Business Intelligence y tableros de control:</w:t>
       </w:r>
       <w:r>
         <w:rPr>
@@ -781,38 +812,7 @@
           <w:color w:val="1A202C"/>
           <w:sz w:val="18"/>
         </w:rPr>
-        <w:t xml:space="preserve"> y modelos en Excel avanzado para supervisión de siniestros y reclamos de alta volumetría.</w:t>
-      </w:r>
-    </w:p>
-    <w:p>
-      <w:pPr>
-        <w:spacing w:before="0" w:after="20"/>
-        <w:ind w:left="360" w:hanging="240"/>
-      </w:pPr>
-      <w:r>
-        <w:rPr>
-          <w:rFonts w:ascii="Calibri" w:hAnsi="Calibri"/>
-          <w:color w:val="1A202C"/>
-          <w:sz w:val="18"/>
-        </w:rPr>
-        <w:t xml:space="preserve">• </w:t>
-      </w:r>
-      <w:r>
-        <w:rPr>
-          <w:rFonts w:ascii="Calibri" w:hAnsi="Calibri"/>
-          <w:b/>
-          <w:color w:val="1A202C"/>
-          <w:sz w:val="18"/>
-        </w:rPr>
-        <w:t xml:space="preserve">Detección de patrones anómalos y análisis SQL:</w:t>
-      </w:r>
-      <w:r>
-        <w:rPr>
-          <w:rFonts w:ascii="Calibri" w:hAnsi="Calibri"/>
-          <w:color w:val="1A202C"/>
-          <w:sz w:val="18"/>
-        </w:rPr>
-        <w:t xml:space="preserve"> Extracción y limpieza de datos operativos con consultas analíticas en SQL y reporting automatizado para identificar desvíos sistemáticos y mitigar pérdidas financieras.</w:t>
+        <w:t xml:space="preserve"> y modelos en Excel avanzado para la trazabilidad y análisis de reclamos y siniestros de alta volumetría.</w:t>
       </w:r>
     </w:p>
     <w:p>

</xml_diff>

<commit_message>
feat(pdf): actualizar experiencia laboral y desglosar sector bancario en PDF y DOCX
</commit_message>
<xml_diff>
--- a/CV_Ruben_Barrios_Analista_De_Datos.docx
+++ b/CV_Ruben_Barrios_Analista_De_Datos.docx
@@ -874,7 +874,7 @@
                 <w:color w:val="1A202C"/>
                 <w:sz w:val="21"/>
               </w:rPr>
-              <w:t>Sector Bancario y Finanzas Internacionales | Caracas, Venezuela</w:t>
+              <w:t>Sector Bancario — Operaciones Internacionales &amp; Finanzas Corporativas | Caracas, Venezuela</w:t>
             </w:r>
           </w:p>
         </w:tc>
@@ -911,7 +911,7 @@
           <w:color w:val="2B6CB0"/>
           <w:sz w:val="19"/>
         </w:rPr>
-        <w:t xml:space="preserve">Especialista de Comercio Exterior / Analista Financiero y Operaciones — BFC Banco Fondo Común, Banco Exterior, Banco Venezolano de Crédito</w:t>
+        <w:t xml:space="preserve">Especialista de Comercio Exterior (BFC Banco Fondo Común) | Analista de Operaciones Internacionales (Banco Exterior) | Analista de Compras &amp; Representante de Ventas (Venezolano de Crédito S.A.)</w:t>
       </w:r>
     </w:p>
     <w:p>
@@ -934,15 +934,15 @@
           <w:color w:val="1A202C"/>
           <w:sz w:val="18"/>
         </w:rPr>
-        <w:t xml:space="preserve">Gestión y análisis de operaciones financieras:</w:t>
-      </w:r>
-      <w:r>
-        <w:rPr>
-          <w:rFonts w:ascii="Calibri" w:hAnsi="Calibri"/>
-          <w:color w:val="1A202C"/>
-          <w:sz w:val="18"/>
-        </w:rPr>
-        <w:t xml:space="preserve"> Más de 15 años administrando operaciones de comercio exterior, cartas de crédito, cobranzas documentarias y divisas con estricta trazabilidad de fondos.</w:t>
+        <w:t xml:space="preserve">Comercio Exterior y Operaciones Internacionales (BFC / Banco Exterior):</w:t>
+      </w:r>
+      <w:r>
+        <w:rPr>
+          <w:rFonts w:ascii="Calibri" w:hAnsi="Calibri"/>
+          <w:color w:val="1A202C"/>
+          <w:sz w:val="18"/>
+        </w:rPr>
+        <w:t xml:space="preserve"> Gestión integral de importaciones, cartas de crédito comerciales, cobranzas documentarias, liquidación de divisas y estricta trazabilidad de fondos.</w:t>
       </w:r>
     </w:p>
     <w:p>
@@ -965,15 +965,15 @@
           <w:color w:val="1A202C"/>
           <w:sz w:val="18"/>
         </w:rPr>
-        <w:t xml:space="preserve">Control analítico y conciliaciones contables:</w:t>
-      </w:r>
-      <w:r>
-        <w:rPr>
-          <w:rFonts w:ascii="Calibri" w:hAnsi="Calibri"/>
-          <w:color w:val="1A202C"/>
-          <w:sz w:val="18"/>
-        </w:rPr>
-        <w:t xml:space="preserve"> Supervisión de auxiliares contables, conciliaciones bancarias complejas y auditoría de datos financieros bajo riguroso cumplimiento normativo y regulatorio.</w:t>
+        <w:t xml:space="preserve">Control analítico, conciliaciones y auditoría:</w:t>
+      </w:r>
+      <w:r>
+        <w:rPr>
+          <w:rFonts w:ascii="Calibri" w:hAnsi="Calibri"/>
+          <w:color w:val="1A202C"/>
+          <w:sz w:val="18"/>
+        </w:rPr>
+        <w:t xml:space="preserve"> Supervisión de auxiliares contables, conciliaciones bancarias y auditoría de datos financieros bajo riguroso cumplimiento normativo y regulatorio.</w:t>
       </w:r>
     </w:p>
     <w:p>
@@ -996,15 +996,15 @@
           <w:color w:val="1A202C"/>
           <w:sz w:val="18"/>
         </w:rPr>
-        <w:t xml:space="preserve">Riesgo y optimización operativa:</w:t>
-      </w:r>
-      <w:r>
-        <w:rPr>
-          <w:rFonts w:ascii="Calibri" w:hAnsi="Calibri"/>
-          <w:color w:val="1A202C"/>
-          <w:sz w:val="18"/>
-        </w:rPr>
-        <w:t xml:space="preserve"> Control de riesgos operacionales y cambiarios, elaboración de reportes cuantitativos para comités ejecutivos y auditoría interna.</w:t>
+        <w:t xml:space="preserve">Compras, gestión comercial y caja (Venezolano de Crédito S.A.):</w:t>
+      </w:r>
+      <w:r>
+        <w:rPr>
+          <w:rFonts w:ascii="Calibri" w:hAnsi="Calibri"/>
+          <w:color w:val="1A202C"/>
+          <w:sz w:val="18"/>
+        </w:rPr>
+        <w:t xml:space="preserve"> Manejo de presupuestos y adquisición de activos operativos para el funcionamiento del banco; operaciones de caja, fidelización y cumplimiento de metas comerciales.</w:t>
       </w:r>
     </w:p>
     <w:p>

</xml_diff>

<commit_message>
feat(pdf): optimizar CV al 100% con estandar ATS segun CV_ATS.jpeg (cuadrantes, encabezado delimitado, secciones idiomas y referencias)
</commit_message>
<xml_diff>
--- a/CV_Ruben_Barrios_Analista_De_Datos.docx
+++ b/CV_Ruben_Barrios_Analista_De_Datos.docx
@@ -4,14 +4,22 @@
   <w:body>
     <w:p>
       <w:pPr>
+        <w:spacing w:before="0" w:after="30"/>
+        <w:pBdr>
+          <w:bottom w:val="single" w:sz="6" w:space="1" w:color="0F172A"/>
+        </w:pBdr>
+      </w:pPr>
+    </w:p>
+    <w:p>
+      <w:pPr>
         <w:jc w:val="center"/>
-        <w:spacing w:before="0" w:after="40"/>
-      </w:pPr>
-      <w:r>
-        <w:rPr>
-          <w:rFonts w:ascii="Calibri" w:hAnsi="Calibri"/>
-          <w:b/>
-          <w:color w:val="1A365D"/>
+        <w:spacing w:before="0" w:after="30"/>
+      </w:pPr>
+      <w:r>
+        <w:rPr>
+          <w:rFonts w:ascii="Calibri" w:hAnsi="Calibri"/>
+          <w:b/>
+          <w:color w:val="0F172A"/>
           <w:sz w:val="32"/>
         </w:rPr>
         <w:t xml:space="preserve">RUBÉN DAVID BARRIOS BELLO</w:t>
@@ -20,13 +28,13 @@
     <w:p>
       <w:pPr>
         <w:jc w:val="center"/>
-        <w:spacing w:before="0" w:after="40"/>
-      </w:pPr>
-      <w:r>
-        <w:rPr>
-          <w:rFonts w:ascii="Calibri" w:hAnsi="Calibri"/>
-          <w:b/>
-          <w:color w:val="2B6CB0"/>
+        <w:spacing w:before="0" w:after="30"/>
+      </w:pPr>
+      <w:r>
+        <w:rPr>
+          <w:rFonts w:ascii="Calibri" w:hAnsi="Calibri"/>
+          <w:b/>
+          <w:color w:val="1E3A8A"/>
           <w:sz w:val="21"/>
         </w:rPr>
         <w:t xml:space="preserve">Data Analyst | Business Intelligence &amp; Fraud Prevention | Lic. en Banca y Finanzas</w:t>
@@ -40,53 +48,61 @@
       <w:r>
         <w:rPr>
           <w:rFonts w:ascii="Calibri" w:hAnsi="Calibri"/>
-          <w:color w:val="1A202C"/>
-          <w:sz w:val="18"/>
-        </w:rPr>
-        <w:t xml:space="preserve">Buenos Aires, Argentina | rubendavid1809@gmail.com | Tel. +54 9 11 7025-9429</w:t>
+          <w:color w:val="111827"/>
+          <w:sz w:val="18"/>
+        </w:rPr>
+        <w:t xml:space="preserve">Tel: +54 9 11 7025-9429 | Email: rubendavid1809@gmail.com | Ubicación: Buenos Aires, Argentina</w:t>
       </w:r>
     </w:p>
     <w:p>
       <w:pPr>
         <w:jc w:val="center"/>
+        <w:spacing w:before="0" w:after="30"/>
+      </w:pPr>
+      <w:r>
+        <w:rPr>
+          <w:rFonts w:ascii="Calibri" w:hAnsi="Calibri"/>
+          <w:color w:val="1D4ED8"/>
+          <w:sz w:val="18"/>
+        </w:rPr>
+        <w:t xml:space="preserve">LinkedIn: linkedin.com/in/ruben-barrios-1430712ab | GitHub: github.com/rubenbarrios-bigdata | CV Web: rubenbarrios-bigdata.github.io/cv-ejecutivo-inteligente/</w:t>
+      </w:r>
+    </w:p>
+    <w:p>
+      <w:pPr>
         <w:spacing w:before="0" w:after="80"/>
-      </w:pPr>
-      <w:r>
-        <w:rPr>
-          <w:rFonts w:ascii="Calibri" w:hAnsi="Calibri"/>
-          <w:color w:val="2B6CB0"/>
-          <w:sz w:val="18"/>
-        </w:rPr>
-        <w:t xml:space="preserve">LinkedIn: linkedin.com/in/ruben-barrios-1430712ab | GitHub: github.com/rubenbarrios-bigdata | CV Digital: rubenbarrios-bigdata.github.io/cv-ejecutivo-inteligente/</w:t>
-      </w:r>
+        <w:pBdr>
+          <w:bottom w:val="single" w:sz="6" w:space="1" w:color="0F172A"/>
+        </w:pBdr>
+      </w:pPr>
     </w:p>
     <w:p>
       <w:pPr>
         <w:spacing w:before="140" w:after="40"/>
         <w:pBdr>
-          <w:bottom w:val="single" w:sz="6" w:space="1" w:color="1A365D"/>
+          <w:bottom w:val="single" w:sz="6" w:space="1" w:color="0F172A"/>
         </w:pBdr>
       </w:pPr>
       <w:r>
         <w:rPr>
           <w:rFonts w:ascii="Calibri" w:hAnsi="Calibri"/>
           <w:b/>
-          <w:color w:val="1A365D"/>
+          <w:color w:val="0F172A"/>
           <w:sz w:val="24"/>
         </w:rPr>
-        <w:t>RESUMEN PROFESIONAL</w:t>
+        <w:t>PERFIL PROFESIONAL</w:t>
       </w:r>
     </w:p>
     <w:p>
       <w:pPr>
         <w:jc w:val="both"/>
-        <w:spacing w:before="0" w:after="100"/>
-      </w:pPr>
-      <w:r>
-        <w:rPr>
-          <w:rFonts w:ascii="Calibri" w:hAnsi="Calibri"/>
-          <w:b/>
-          <w:color w:val="1A202C"/>
+        <w:spacing w:before="0" w:after="80"/>
+      </w:pPr>
+      <w:r>
+        <w:rPr>
+          <w:rFonts w:ascii="Calibri" w:hAnsi="Calibri"/>
+          <w:b/>
+          <w:color w:val="111827"/>
           <w:sz w:val="19"/>
         </w:rPr>
         <w:t xml:space="preserve">Analista de Datos</w:t>
@@ -94,7 +110,7 @@
       <w:r>
         <w:rPr>
           <w:rFonts w:ascii="Calibri" w:hAnsi="Calibri"/>
-          <w:color w:val="1A202C"/>
+          <w:color w:val="111827"/>
           <w:sz w:val="19"/>
         </w:rPr>
         <w:t xml:space="preserve"> con experiencia comprobada en análisis de métricas de fraude en logística para e-commerce y distribución de última milla (Last-Mile Fulfillment), complementada por más de 15 años de sólida trayectoria en el sector bancario, negocios internacionales y finanzas corporativas. Hoy combino esa visión estratégica con un enfoque resolutivo orientado a transformar requerimientos de negocio en soluciones analíticas de alto impacto mediante el diseño de dashboards en </w:t>
@@ -103,7 +119,7 @@
         <w:rPr>
           <w:rFonts w:ascii="Calibri" w:hAnsi="Calibri"/>
           <w:b/>
-          <w:color w:val="1A202C"/>
+          <w:color w:val="111827"/>
           <w:sz w:val="19"/>
         </w:rPr>
         <w:t xml:space="preserve">Excel y Power BI</w:t>
@@ -111,7 +127,7 @@
       <w:r>
         <w:rPr>
           <w:rFonts w:ascii="Calibri" w:hAnsi="Calibri"/>
-          <w:color w:val="1A202C"/>
+          <w:color w:val="111827"/>
           <w:sz w:val="19"/>
         </w:rPr>
         <w:t xml:space="preserve">, consultas </w:t>
@@ -120,7 +136,7 @@
         <w:rPr>
           <w:rFonts w:ascii="Calibri" w:hAnsi="Calibri"/>
           <w:b/>
-          <w:color w:val="1A202C"/>
+          <w:color w:val="111827"/>
           <w:sz w:val="19"/>
         </w:rPr>
         <w:t xml:space="preserve">SQL (MySQL, PostgreSQL)</w:t>
@@ -128,7 +144,7 @@
       <w:r>
         <w:rPr>
           <w:rFonts w:ascii="Calibri" w:hAnsi="Calibri"/>
-          <w:color w:val="1A202C"/>
+          <w:color w:val="111827"/>
           <w:sz w:val="19"/>
         </w:rPr>
         <w:t xml:space="preserve">, automatización con </w:t>
@@ -137,7 +153,7 @@
         <w:rPr>
           <w:rFonts w:ascii="Calibri" w:hAnsi="Calibri"/>
           <w:b/>
-          <w:color w:val="1A202C"/>
+          <w:color w:val="111827"/>
           <w:sz w:val="19"/>
         </w:rPr>
         <w:t xml:space="preserve">Python (pandas)</w:t>
@@ -145,7 +161,7 @@
       <w:r>
         <w:rPr>
           <w:rFonts w:ascii="Calibri" w:hAnsi="Calibri"/>
-          <w:color w:val="1A202C"/>
+          <w:color w:val="111827"/>
           <w:sz w:val="19"/>
         </w:rPr>
         <w:t xml:space="preserve"> y analítica digital de productos con </w:t>
@@ -154,7 +170,7 @@
         <w:rPr>
           <w:rFonts w:ascii="Calibri" w:hAnsi="Calibri"/>
           <w:b/>
-          <w:color w:val="1A202C"/>
+          <w:color w:val="111827"/>
           <w:sz w:val="19"/>
         </w:rPr>
         <w:t xml:space="preserve">GTM, GA4, BigQuery y Data Studio</w:t>
@@ -162,7 +178,7 @@
       <w:r>
         <w:rPr>
           <w:rFonts w:ascii="Calibri" w:hAnsi="Calibri"/>
-          <w:color w:val="1A202C"/>
+          <w:color w:val="111827"/>
           <w:sz w:val="19"/>
         </w:rPr>
         <w:t xml:space="preserve">.</w:t>
@@ -176,7 +192,7 @@
       <w:r>
         <w:rPr>
           <w:rFonts w:ascii="Calibri" w:hAnsi="Calibri"/>
-          <w:color w:val="1A202C"/>
+          <w:color w:val="111827"/>
           <w:sz w:val="19"/>
         </w:rPr>
         <w:t xml:space="preserve">Historial comprobado en optimización de indicadores de negocio, destacando la </w:t>
@@ -185,7 +201,7 @@
         <w:rPr>
           <w:rFonts w:ascii="Calibri" w:hAnsi="Calibri"/>
           <w:b/>
-          <w:color w:val="1A202C"/>
+          <w:color w:val="111827"/>
           <w:sz w:val="19"/>
         </w:rPr>
         <w:t xml:space="preserve">reducción del 80% en el ratio histórico de siniestralidad por fraude (de 0,150% a 0,030%)</w:t>
@@ -193,7 +209,7 @@
       <w:r>
         <w:rPr>
           <w:rFonts w:ascii="Calibri" w:hAnsi="Calibri"/>
-          <w:color w:val="1A202C"/>
+          <w:color w:val="111827"/>
           <w:sz w:val="19"/>
         </w:rPr>
         <w:t xml:space="preserve"> en operaciones de alto volumen mediante el monitoreo continuo de métricas. Perfil analítico orientado a la toma de decisiones basada en evidencia y trabajo multidisciplinario con equipos de Producto, Backend y Operaciones.</w:t>
@@ -203,28 +219,28 @@
       <w:pPr>
         <w:spacing w:before="140" w:after="40"/>
         <w:pBdr>
-          <w:bottom w:val="single" w:sz="6" w:space="1" w:color="1A365D"/>
+          <w:bottom w:val="single" w:sz="6" w:space="1" w:color="0F172A"/>
         </w:pBdr>
       </w:pPr>
       <w:r>
         <w:rPr>
           <w:rFonts w:ascii="Calibri" w:hAnsi="Calibri"/>
           <w:b/>
-          <w:color w:val="1A365D"/>
+          <w:color w:val="0F172A"/>
           <w:sz w:val="24"/>
         </w:rPr>
-        <w:t>HABILIDADES TÉCNICAS</w:t>
-      </w:r>
-    </w:p>
-    <w:p>
-      <w:pPr>
-        <w:spacing w:before="0" w:after="30"/>
-        <w:ind w:left="360" w:hanging="240"/>
-      </w:pPr>
-      <w:r>
-        <w:rPr>
-          <w:rFonts w:ascii="Calibri" w:hAnsi="Calibri"/>
-          <w:color w:val="1A202C"/>
+        <w:t>HABILIDADES TÉCNICAS Y COMPETENCIAS</w:t>
+      </w:r>
+    </w:p>
+    <w:p>
+      <w:pPr>
+        <w:spacing w:before="0" w:after="25"/>
+        <w:ind w:left="360" w:hanging="240"/>
+      </w:pPr>
+      <w:r>
+        <w:rPr>
+          <w:rFonts w:ascii="Calibri" w:hAnsi="Calibri"/>
+          <w:color w:val="111827"/>
           <w:sz w:val="19"/>
         </w:rPr>
         <w:t xml:space="preserve">• </w:t>
@@ -233,7 +249,7 @@
         <w:rPr>
           <w:rFonts w:ascii="Calibri" w:hAnsi="Calibri"/>
           <w:b/>
-          <w:color w:val="1A202C"/>
+          <w:color w:val="111827"/>
           <w:sz w:val="19"/>
         </w:rPr>
         <w:t xml:space="preserve">Análisis de Datos y BI:</w:t>
@@ -241,21 +257,21 @@
       <w:r>
         <w:rPr>
           <w:rFonts w:ascii="Calibri" w:hAnsi="Calibri"/>
-          <w:color w:val="1A202C"/>
+          <w:color w:val="111827"/>
           <w:sz w:val="19"/>
         </w:rPr>
-        <w:t xml:space="preserve"> Power BI (DAX avanzado, Power Query, modelado dimensional, PBIP), SQL (MySQL, PostgreSQL: queries complejas, subconsultas, agregaciones), Python (pandas, NumPy, Matplotlib, Colab, VSCode), Excel avanzado (tablas dinámicas, fórmulas complejas).</w:t>
-      </w:r>
-    </w:p>
-    <w:p>
-      <w:pPr>
-        <w:spacing w:before="0" w:after="30"/>
-        <w:ind w:left="360" w:hanging="240"/>
-      </w:pPr>
-      <w:r>
-        <w:rPr>
-          <w:rFonts w:ascii="Calibri" w:hAnsi="Calibri"/>
-          <w:color w:val="1A202C"/>
+        <w:t xml:space="preserve"> Power BI (DAX avanzado, Power Query, modelado dimensional, PBIP), SQL (MySQL, PostgreSQL: queries complejas, subconsultas, agregaciones), Python (pandas, NumPy, Matplotlib, Colab, VSCode), Excel avanzado (tablas dinámicas, fórmulas matriciales).</w:t>
+      </w:r>
+    </w:p>
+    <w:p>
+      <w:pPr>
+        <w:spacing w:before="0" w:after="25"/>
+        <w:ind w:left="360" w:hanging="240"/>
+      </w:pPr>
+      <w:r>
+        <w:rPr>
+          <w:rFonts w:ascii="Calibri" w:hAnsi="Calibri"/>
+          <w:color w:val="111827"/>
           <w:sz w:val="19"/>
         </w:rPr>
         <w:t xml:space="preserve">• </w:t>
@@ -264,7 +280,7 @@
         <w:rPr>
           <w:rFonts w:ascii="Calibri" w:hAnsi="Calibri"/>
           <w:b/>
-          <w:color w:val="1A202C"/>
+          <w:color w:val="111827"/>
           <w:sz w:val="19"/>
         </w:rPr>
         <w:t xml:space="preserve">Visualización y Producto:</w:t>
@@ -272,7 +288,7 @@
       <w:r>
         <w:rPr>
           <w:rFonts w:ascii="Calibri" w:hAnsi="Calibri"/>
-          <w:color w:val="1A202C"/>
+          <w:color w:val="111827"/>
           <w:sz w:val="19"/>
         </w:rPr>
         <w:t xml:space="preserve"> Looker Studio, Google Analytics 4 (GA4), Google Tag Manager (GTM), Supabase, Firebase, BigQuery, diseño de KPIs ejecutivos, análisis de retención, engagement, funnel y conversión.</w:t>
@@ -280,13 +296,13 @@
     </w:p>
     <w:p>
       <w:pPr>
-        <w:spacing w:before="0" w:after="30"/>
-        <w:ind w:left="360" w:hanging="240"/>
-      </w:pPr>
-      <w:r>
-        <w:rPr>
-          <w:rFonts w:ascii="Calibri" w:hAnsi="Calibri"/>
-          <w:color w:val="1A202C"/>
+        <w:spacing w:before="0" w:after="50"/>
+        <w:ind w:left="360" w:hanging="240"/>
+      </w:pPr>
+      <w:r>
+        <w:rPr>
+          <w:rFonts w:ascii="Calibri" w:hAnsi="Calibri"/>
+          <w:color w:val="111827"/>
           <w:sz w:val="19"/>
         </w:rPr>
         <w:t xml:space="preserve">• </w:t>
@@ -295,7 +311,7 @@
         <w:rPr>
           <w:rFonts w:ascii="Calibri" w:hAnsi="Calibri"/>
           <w:b/>
-          <w:color w:val="1A202C"/>
+          <w:color w:val="111827"/>
           <w:sz w:val="19"/>
         </w:rPr>
         <w:t xml:space="preserve">Negocio y Metodologías:</w:t>
@@ -303,55 +319,24 @@
       <w:r>
         <w:rPr>
           <w:rFonts w:ascii="Calibri" w:hAnsi="Calibri"/>
-          <w:color w:val="1A202C"/>
+          <w:color w:val="111827"/>
           <w:sz w:val="19"/>
         </w:rPr>
-        <w:t xml:space="preserve"> Prevención de Fraudes, Detección de Anomalías en Logística/E-Commerce, Finanzas, Comercio Exterior, Git/GitHub, CI/CD para BI, Scrum/Ágil, IA Generativa aplicada (ChatGPT, Copilot, Gemini, Claude, Make).</w:t>
-      </w:r>
-    </w:p>
-    <w:p>
-      <w:pPr>
-        <w:spacing w:before="0" w:after="60"/>
-        <w:ind w:left="360" w:hanging="240"/>
-      </w:pPr>
-      <w:r>
-        <w:rPr>
-          <w:rFonts w:ascii="Calibri" w:hAnsi="Calibri"/>
-          <w:color w:val="1A202C"/>
-          <w:sz w:val="19"/>
-        </w:rPr>
-        <w:t xml:space="preserve">• </w:t>
-      </w:r>
-      <w:r>
-        <w:rPr>
-          <w:rFonts w:ascii="Calibri" w:hAnsi="Calibri"/>
-          <w:b/>
-          <w:color w:val="1A202C"/>
-          <w:sz w:val="19"/>
-        </w:rPr>
-        <w:t xml:space="preserve">Idiomas:</w:t>
-      </w:r>
-      <w:r>
-        <w:rPr>
-          <w:rFonts w:ascii="Calibri" w:hAnsi="Calibri"/>
-          <w:color w:val="1A202C"/>
-          <w:sz w:val="19"/>
-        </w:rPr>
-        <w:t xml:space="preserve"> Español (Nativo) | Inglés (Técnico / Lectura y comprensión profesional).</w:t>
+        <w:t xml:space="preserve"> Prevención de Fraudes, Detección de Anomalías en Logística/E-Commerce, Finanzas Corporativas, Comercio Exterior, Git/GitHub, CI/CD para BI, Scrum/Ágil, IA Generativa aplicada (ChatGPT, Copilot, Gemini, Claude, Make).</w:t>
       </w:r>
     </w:p>
     <w:p>
       <w:pPr>
         <w:spacing w:before="140" w:after="40"/>
         <w:pBdr>
-          <w:bottom w:val="single" w:sz="6" w:space="1" w:color="1A365D"/>
+          <w:bottom w:val="single" w:sz="6" w:space="1" w:color="0F172A"/>
         </w:pBdr>
       </w:pPr>
       <w:r>
         <w:rPr>
           <w:rFonts w:ascii="Calibri" w:hAnsi="Calibri"/>
           <w:b/>
-          <w:color w:val="1A365D"/>
+          <w:color w:val="0F172A"/>
           <w:sz w:val="24"/>
         </w:rPr>
         <w:t>EXPERIENCIA LABORAL</w:t>
@@ -376,16 +361,16 @@
           </w:tcPr>
           <w:p>
             <w:pPr>
-              <w:spacing w:before="60" w:after="20"/>
+              <w:spacing w:before="60" w:after="10"/>
             </w:pPr>
             <w:r>
               <w:rPr>
                 <w:rFonts w:ascii="Calibri" w:hAnsi="Calibri"/>
                 <w:b/>
-                <w:color w:val="1A202C"/>
+                <w:color w:val="111827"/>
                 <w:sz w:val="21"/>
               </w:rPr>
-              <w:t>Innova Lab — Proyecto Mate-Mático | Buenos Aires, Argentina</w:t>
+              <w:t>Innova Lab — Proyecto Mate-Mático</w:t>
             </w:r>
           </w:p>
         </w:tc>
@@ -396,13 +381,54 @@
           <w:p>
             <w:pPr>
               <w:jc w:val="right"/>
-              <w:spacing w:before="60" w:after="20"/>
+              <w:spacing w:before="60" w:after="10"/>
+            </w:pPr>
+            <w:r>
+              <w:rPr>
+                <w:rFonts w:ascii="Calibri" w:hAnsi="Calibri"/>
+                <w:b/>
+                <w:color w:val="111827"/>
+                <w:sz w:val="20"/>
+              </w:rPr>
+              <w:t>Buenos Aires, Argentina</w:t>
+            </w:r>
+          </w:p>
+        </w:tc>
+      </w:tr>
+      <w:tr>
+        <w:tc>
+          <w:tcPr>
+            <w:tcW w:w="7200" w:type="dxa"/>
+          </w:tcPr>
+          <w:p>
+            <w:pPr>
+              <w:spacing w:before="0" w:after="25"/>
             </w:pPr>
             <w:r>
               <w:rPr>
                 <w:rFonts w:ascii="Calibri" w:hAnsi="Calibri"/>
                 <w:i/>
-                <w:color w:val="4A5568"/>
+                <w:color w:val="1E3A8A"/>
+                <w:sz w:val="19"/>
+              </w:rPr>
+              <w:t>Data Analyst &amp; Digital Analytics Specialist (Proyecto MVP)</w:t>
+            </w:r>
+          </w:p>
+        </w:tc>
+        <w:tc>
+          <w:tcPr>
+            <w:tcW w:w="2800" w:type="dxa"/>
+          </w:tcPr>
+          <w:p>
+            <w:pPr>
+              <w:jc w:val="right"/>
+              <w:spacing w:before="0" w:after="25"/>
+            </w:pPr>
+            <w:r>
+              <w:rPr>
+                <w:rFonts w:ascii="Calibri" w:hAnsi="Calibri"/>
+                <w:i/>
+                <w:color w:val="4B5563"/>
                 <w:sz w:val="19"/>
               </w:rPr>
               <w:t>Jul. 2026 – Presente</w:t>
@@ -413,36 +439,22 @@
     </w:tbl>
     <w:p>
       <w:pPr>
-        <w:spacing w:before="0" w:after="30"/>
-      </w:pPr>
-      <w:r>
-        <w:rPr>
-          <w:rFonts w:ascii="Calibri" w:hAnsi="Calibri"/>
-          <w:b/>
-          <w:color w:val="2B6CB0"/>
-          <w:sz w:val="19"/>
-        </w:rPr>
-        <w:t xml:space="preserve">Data Analyst &amp; Digital Analytics Specialist (Proyecto MVP)</w:t>
-      </w:r>
-    </w:p>
-    <w:p>
-      <w:pPr>
         <w:spacing w:before="0" w:after="20"/>
         <w:ind w:left="360" w:hanging="240"/>
       </w:pPr>
       <w:r>
         <w:rPr>
           <w:rFonts w:ascii="Calibri" w:hAnsi="Calibri"/>
-          <w:color w:val="1A202C"/>
-          <w:sz w:val="18"/>
-        </w:rPr>
-        <w:t xml:space="preserve">• </w:t>
-      </w:r>
-      <w:r>
-        <w:rPr>
-          <w:rFonts w:ascii="Calibri" w:hAnsi="Calibri"/>
-          <w:b/>
-          <w:color w:val="1A202C"/>
+          <w:color w:val="111827"/>
+          <w:sz w:val="18"/>
+        </w:rPr>
+        <w:t xml:space="preserve">• </w:t>
+      </w:r>
+      <w:r>
+        <w:rPr>
+          <w:rFonts w:ascii="Calibri" w:hAnsi="Calibri"/>
+          <w:b/>
+          <w:color w:val="111827"/>
           <w:sz w:val="18"/>
         </w:rPr>
         <w:t xml:space="preserve">Liderazgo en arquitectura de datos y analítica digital:</w:t>
@@ -450,7 +462,7 @@
       <w:r>
         <w:rPr>
           <w:rFonts w:ascii="Calibri" w:hAnsi="Calibri"/>
-          <w:color w:val="1A202C"/>
+          <w:color w:val="111827"/>
           <w:sz w:val="18"/>
         </w:rPr>
         <w:t xml:space="preserve"> Diseño e implementación de la infraestructura de medición de producto desde cero para la aplicación educativa Mate-Mático.</w:t>
@@ -464,16 +476,16 @@
       <w:r>
         <w:rPr>
           <w:rFonts w:ascii="Calibri" w:hAnsi="Calibri"/>
-          <w:color w:val="1A202C"/>
-          <w:sz w:val="18"/>
-        </w:rPr>
-        <w:t xml:space="preserve">• </w:t>
-      </w:r>
-      <w:r>
-        <w:rPr>
-          <w:rFonts w:ascii="Calibri" w:hAnsi="Calibri"/>
-          <w:b/>
-          <w:color w:val="1A202C"/>
+          <w:color w:val="111827"/>
+          <w:sz w:val="18"/>
+        </w:rPr>
+        <w:t xml:space="preserve">• </w:t>
+      </w:r>
+      <w:r>
+        <w:rPr>
+          <w:rFonts w:ascii="Calibri" w:hAnsi="Calibri"/>
+          <w:b/>
+          <w:color w:val="111827"/>
           <w:sz w:val="18"/>
         </w:rPr>
         <w:t xml:space="preserve">Modelado de datos en base de datos:</w:t>
@@ -481,7 +493,7 @@
       <w:r>
         <w:rPr>
           <w:rFonts w:ascii="Calibri" w:hAnsi="Calibri"/>
-          <w:color w:val="1A202C"/>
+          <w:color w:val="111827"/>
           <w:sz w:val="18"/>
         </w:rPr>
         <w:t xml:space="preserve"> Estructuración y consulta de tablas en </w:t>
@@ -490,7 +502,7 @@
         <w:rPr>
           <w:rFonts w:ascii="Calibri" w:hAnsi="Calibri"/>
           <w:b/>
-          <w:color w:val="1A202C"/>
+          <w:color w:val="111827"/>
           <w:sz w:val="18"/>
         </w:rPr>
         <w:t xml:space="preserve">Supabase (PostgreSQL)</w:t>
@@ -498,7 +510,7 @@
       <w:r>
         <w:rPr>
           <w:rFonts w:ascii="Calibri" w:hAnsi="Calibri"/>
-          <w:color w:val="1A202C"/>
+          <w:color w:val="111827"/>
           <w:sz w:val="18"/>
         </w:rPr>
         <w:t xml:space="preserve"> y Firebase para captura de eventos transaccionales y métricas de comportamiento de usuarios.</w:t>
@@ -512,16 +524,16 @@
       <w:r>
         <w:rPr>
           <w:rFonts w:ascii="Calibri" w:hAnsi="Calibri"/>
-          <w:color w:val="1A202C"/>
-          <w:sz w:val="18"/>
-        </w:rPr>
-        <w:t xml:space="preserve">• </w:t>
-      </w:r>
-      <w:r>
-        <w:rPr>
-          <w:rFonts w:ascii="Calibri" w:hAnsi="Calibri"/>
-          <w:b/>
-          <w:color w:val="1A202C"/>
+          <w:color w:val="111827"/>
+          <w:sz w:val="18"/>
+        </w:rPr>
+        <w:t xml:space="preserve">• </w:t>
+      </w:r>
+      <w:r>
+        <w:rPr>
+          <w:rFonts w:ascii="Calibri" w:hAnsi="Calibri"/>
+          <w:b/>
+          <w:color w:val="111827"/>
           <w:sz w:val="18"/>
         </w:rPr>
         <w:t xml:space="preserve">Tracking avanzado de eventos:</w:t>
@@ -529,7 +541,7 @@
       <w:r>
         <w:rPr>
           <w:rFonts w:ascii="Calibri" w:hAnsi="Calibri"/>
-          <w:color w:val="1A202C"/>
+          <w:color w:val="111827"/>
           <w:sz w:val="18"/>
         </w:rPr>
         <w:t xml:space="preserve"> Configuración integral de tags, triggers y variables con </w:t>
@@ -538,7 +550,7 @@
         <w:rPr>
           <w:rFonts w:ascii="Calibri" w:hAnsi="Calibri"/>
           <w:b/>
-          <w:color w:val="1A202C"/>
+          <w:color w:val="111827"/>
           <w:sz w:val="18"/>
         </w:rPr>
         <w:t xml:space="preserve">Google Tag Manager (GTM)</w:t>
@@ -546,7 +558,7 @@
       <w:r>
         <w:rPr>
           <w:rFonts w:ascii="Calibri" w:hAnsi="Calibri"/>
-          <w:color w:val="1A202C"/>
+          <w:color w:val="111827"/>
           <w:sz w:val="18"/>
         </w:rPr>
         <w:t xml:space="preserve"> y </w:t>
@@ -555,7 +567,7 @@
         <w:rPr>
           <w:rFonts w:ascii="Calibri" w:hAnsi="Calibri"/>
           <w:b/>
-          <w:color w:val="1A202C"/>
+          <w:color w:val="111827"/>
           <w:sz w:val="18"/>
         </w:rPr>
         <w:t xml:space="preserve">Google Analytics 4 (GA4)</w:t>
@@ -563,7 +575,7 @@
       <w:r>
         <w:rPr>
           <w:rFonts w:ascii="Calibri" w:hAnsi="Calibri"/>
-          <w:color w:val="1A202C"/>
+          <w:color w:val="111827"/>
           <w:sz w:val="18"/>
         </w:rPr>
         <w:t xml:space="preserve">, validando el correcto flujo de datos junto a Backend y QA.</w:t>
@@ -577,16 +589,16 @@
       <w:r>
         <w:rPr>
           <w:rFonts w:ascii="Calibri" w:hAnsi="Calibri"/>
-          <w:color w:val="1A202C"/>
-          <w:sz w:val="18"/>
-        </w:rPr>
-        <w:t xml:space="preserve">• </w:t>
-      </w:r>
-      <w:r>
-        <w:rPr>
-          <w:rFonts w:ascii="Calibri" w:hAnsi="Calibri"/>
-          <w:b/>
-          <w:color w:val="1A202C"/>
+          <w:color w:val="111827"/>
+          <w:sz w:val="18"/>
+        </w:rPr>
+        <w:t xml:space="preserve">• </w:t>
+      </w:r>
+      <w:r>
+        <w:rPr>
+          <w:rFonts w:ascii="Calibri" w:hAnsi="Calibri"/>
+          <w:b/>
+          <w:color w:val="111827"/>
           <w:sz w:val="18"/>
         </w:rPr>
         <w:t xml:space="preserve">Visualización ejecutiva de producto:</w:t>
@@ -594,7 +606,7 @@
       <w:r>
         <w:rPr>
           <w:rFonts w:ascii="Calibri" w:hAnsi="Calibri"/>
-          <w:color w:val="1A202C"/>
+          <w:color w:val="111827"/>
           <w:sz w:val="18"/>
         </w:rPr>
         <w:t xml:space="preserve"> Creación de dashboard analítico en </w:t>
@@ -603,7 +615,7 @@
         <w:rPr>
           <w:rFonts w:ascii="Calibri" w:hAnsi="Calibri"/>
           <w:b/>
-          <w:color w:val="1A202C"/>
+          <w:color w:val="111827"/>
           <w:sz w:val="18"/>
         </w:rPr>
         <w:t xml:space="preserve">Looker Studio</w:t>
@@ -611,7 +623,7 @@
       <w:r>
         <w:rPr>
           <w:rFonts w:ascii="Calibri" w:hAnsi="Calibri"/>
-          <w:color w:val="1A202C"/>
+          <w:color w:val="111827"/>
           <w:sz w:val="18"/>
         </w:rPr>
         <w:t xml:space="preserve"> embebido en la aplicación, monitoreando KPIs de uso, retención, progresión académica y conversión.</w:t>
@@ -636,16 +648,16 @@
           </w:tcPr>
           <w:p>
             <w:pPr>
-              <w:spacing w:before="60" w:after="20"/>
+              <w:spacing w:before="60" w:after="10"/>
             </w:pPr>
             <w:r>
               <w:rPr>
                 <w:rFonts w:ascii="Calibri" w:hAnsi="Calibri"/>
                 <w:b/>
-                <w:color w:val="1A202C"/>
+                <w:color w:val="111827"/>
                 <w:sz w:val="21"/>
               </w:rPr>
-              <w:t>Webpack S.R.L — Logística Mercado Libre | Buenos Aires, Argentina</w:t>
+              <w:t>Webpack S.R.L. — Operador Logístico Oficial de Mercado Libre</w:t>
             </w:r>
           </w:p>
         </w:tc>
@@ -656,13 +668,54 @@
           <w:p>
             <w:pPr>
               <w:jc w:val="right"/>
-              <w:spacing w:before="60" w:after="20"/>
+              <w:spacing w:before="60" w:after="10"/>
+            </w:pPr>
+            <w:r>
+              <w:rPr>
+                <w:rFonts w:ascii="Calibri" w:hAnsi="Calibri"/>
+                <w:b/>
+                <w:color w:val="111827"/>
+                <w:sz w:val="20"/>
+              </w:rPr>
+              <w:t>Buenos Aires, Argentina</w:t>
+            </w:r>
+          </w:p>
+        </w:tc>
+      </w:tr>
+      <w:tr>
+        <w:tc>
+          <w:tcPr>
+            <w:tcW w:w="7200" w:type="dxa"/>
+          </w:tcPr>
+          <w:p>
+            <w:pPr>
+              <w:spacing w:before="0" w:after="25"/>
             </w:pPr>
             <w:r>
               <w:rPr>
                 <w:rFonts w:ascii="Calibri" w:hAnsi="Calibri"/>
                 <w:i/>
-                <w:color w:val="4A5568"/>
+                <w:color w:val="1E3A8A"/>
+                <w:sz w:val="19"/>
+              </w:rPr>
+              <w:t>Data Analyst | Fraud Prevention | E-commerce Logistics &amp; Last-Mile</w:t>
+            </w:r>
+          </w:p>
+        </w:tc>
+        <w:tc>
+          <w:tcPr>
+            <w:tcW w:w="2800" w:type="dxa"/>
+          </w:tcPr>
+          <w:p>
+            <w:pPr>
+              <w:jc w:val="right"/>
+              <w:spacing w:before="0" w:after="25"/>
+            </w:pPr>
+            <w:r>
+              <w:rPr>
+                <w:rFonts w:ascii="Calibri" w:hAnsi="Calibri"/>
+                <w:i/>
+                <w:color w:val="4B5563"/>
                 <w:sz w:val="19"/>
               </w:rPr>
               <w:t>Mar. 2020 – Oct. 2024</w:t>
@@ -673,20 +726,6 @@
     </w:tbl>
     <w:p>
       <w:pPr>
-        <w:spacing w:before="0" w:after="30"/>
-      </w:pPr>
-      <w:r>
-        <w:rPr>
-          <w:rFonts w:ascii="Calibri" w:hAnsi="Calibri"/>
-          <w:b/>
-          <w:color w:val="2B6CB0"/>
-          <w:sz w:val="19"/>
-        </w:rPr>
-        <w:t xml:space="preserve">Data Analyst | Fraud Prevention | E-commerce Logistics &amp; Last-Mile Fulfillment</w:t>
-      </w:r>
-    </w:p>
-    <w:p>
-      <w:pPr>
         <w:spacing w:before="0" w:after="25"/>
         <w:ind w:left="360" w:hanging="240"/>
       </w:pPr>
@@ -694,16 +733,16 @@
         <w:rPr>
           <w:rFonts w:ascii="Calibri" w:hAnsi="Calibri"/>
           <w:b/>
-          <w:color w:val="1A365D"/>
-          <w:sz w:val="18"/>
-        </w:rPr>
-        <w:t xml:space="preserve">• </w:t>
-      </w:r>
-      <w:r>
-        <w:rPr>
-          <w:rFonts w:ascii="Calibri" w:hAnsi="Calibri"/>
-          <w:b/>
-          <w:color w:val="1A365D"/>
+          <w:color w:val="0F172A"/>
+          <w:sz w:val="18"/>
+        </w:rPr>
+        <w:t xml:space="preserve">• </w:t>
+      </w:r>
+      <w:r>
+        <w:rPr>
+          <w:rFonts w:ascii="Calibri" w:hAnsi="Calibri"/>
+          <w:b/>
+          <w:color w:val="0F172A"/>
           <w:sz w:val="18"/>
         </w:rPr>
         <w:t xml:space="preserve">Logro Destacado de Negocio:</w:t>
@@ -712,7 +751,7 @@
         <w:rPr>
           <w:rFonts w:ascii="Calibri" w:hAnsi="Calibri"/>
           <w:b/>
-          <w:color w:val="1A365D"/>
+          <w:color w:val="0F172A"/>
           <w:sz w:val="18"/>
         </w:rPr>
         <w:t xml:space="preserve"> Reducción histórica del </w:t>
@@ -721,7 +760,7 @@
         <w:rPr>
           <w:rFonts w:ascii="Calibri" w:hAnsi="Calibri"/>
           <w:b/>
-          <w:color w:val="1A365D"/>
+          <w:color w:val="0F172A"/>
           <w:sz w:val="18"/>
         </w:rPr>
         <w:t xml:space="preserve">80% en el ratio de siniestros por fraude (de 0,150% a 0,030%)</w:t>
@@ -730,7 +769,7 @@
         <w:rPr>
           <w:rFonts w:ascii="Calibri" w:hAnsi="Calibri"/>
           <w:b/>
-          <w:color w:val="1A365D"/>
+          <w:color w:val="0F172A"/>
           <w:sz w:val="18"/>
         </w:rPr>
         <w:t xml:space="preserve">, posicionando a Webpack como la operación logística con el ratio más bajo y eficiente de toda la red de Mercado Libre.</w:t>
@@ -744,16 +783,16 @@
       <w:r>
         <w:rPr>
           <w:rFonts w:ascii="Calibri" w:hAnsi="Calibri"/>
-          <w:color w:val="1A202C"/>
-          <w:sz w:val="18"/>
-        </w:rPr>
-        <w:t xml:space="preserve">• </w:t>
-      </w:r>
-      <w:r>
-        <w:rPr>
-          <w:rFonts w:ascii="Calibri" w:hAnsi="Calibri"/>
-          <w:b/>
-          <w:color w:val="1A202C"/>
+          <w:color w:val="111827"/>
+          <w:sz w:val="18"/>
+        </w:rPr>
+        <w:t xml:space="preserve">• </w:t>
+      </w:r>
+      <w:r>
+        <w:rPr>
+          <w:rFonts w:ascii="Calibri" w:hAnsi="Calibri"/>
+          <w:b/>
+          <w:color w:val="111827"/>
           <w:sz w:val="18"/>
         </w:rPr>
         <w:t xml:space="preserve">Detección de patrones anómalos y análisis SQL:</w:t>
@@ -761,7 +800,7 @@
       <w:r>
         <w:rPr>
           <w:rFonts w:ascii="Calibri" w:hAnsi="Calibri"/>
-          <w:color w:val="1A202C"/>
+          <w:color w:val="111827"/>
           <w:sz w:val="18"/>
         </w:rPr>
         <w:t xml:space="preserve"> Extracción y limpieza de datos operativos con consultas analíticas en SQL y reporting automatizado para identificar desvíos sistemáticos y mitigar pérdidas financieras.</w:t>
@@ -775,16 +814,16 @@
       <w:r>
         <w:rPr>
           <w:rFonts w:ascii="Calibri" w:hAnsi="Calibri"/>
-          <w:color w:val="1A202C"/>
-          <w:sz w:val="18"/>
-        </w:rPr>
-        <w:t xml:space="preserve">• </w:t>
-      </w:r>
-      <w:r>
-        <w:rPr>
-          <w:rFonts w:ascii="Calibri" w:hAnsi="Calibri"/>
-          <w:b/>
-          <w:color w:val="1A202C"/>
+          <w:color w:val="111827"/>
+          <w:sz w:val="18"/>
+        </w:rPr>
+        <w:t xml:space="preserve">• </w:t>
+      </w:r>
+      <w:r>
+        <w:rPr>
+          <w:rFonts w:ascii="Calibri" w:hAnsi="Calibri"/>
+          <w:b/>
+          <w:color w:val="111827"/>
           <w:sz w:val="18"/>
         </w:rPr>
         <w:t xml:space="preserve">Business Intelligence y tableros de control:</w:t>
@@ -792,7 +831,7 @@
       <w:r>
         <w:rPr>
           <w:rFonts w:ascii="Calibri" w:hAnsi="Calibri"/>
-          <w:color w:val="1A202C"/>
+          <w:color w:val="111827"/>
           <w:sz w:val="18"/>
         </w:rPr>
         <w:t xml:space="preserve"> Diseño, automatización y mantenimiento de dashboards interactivos en </w:t>
@@ -801,7 +840,7 @@
         <w:rPr>
           <w:rFonts w:ascii="Calibri" w:hAnsi="Calibri"/>
           <w:b/>
-          <w:color w:val="1A202C"/>
+          <w:color w:val="111827"/>
           <w:sz w:val="18"/>
         </w:rPr>
         <w:t xml:space="preserve">Power BI (DAX)</w:t>
@@ -809,7 +848,7 @@
       <w:r>
         <w:rPr>
           <w:rFonts w:ascii="Calibri" w:hAnsi="Calibri"/>
-          <w:color w:val="1A202C"/>
+          <w:color w:val="111827"/>
           <w:sz w:val="18"/>
         </w:rPr>
         <w:t xml:space="preserve"> y modelos en Excel avanzado para la trazabilidad y análisis de reclamos y siniestros de alta volumetría.</w:t>
@@ -823,16 +862,16 @@
       <w:r>
         <w:rPr>
           <w:rFonts w:ascii="Calibri" w:hAnsi="Calibri"/>
-          <w:color w:val="1A202C"/>
-          <w:sz w:val="18"/>
-        </w:rPr>
-        <w:t xml:space="preserve">• </w:t>
-      </w:r>
-      <w:r>
-        <w:rPr>
-          <w:rFonts w:ascii="Calibri" w:hAnsi="Calibri"/>
-          <w:b/>
-          <w:color w:val="1A202C"/>
+          <w:color w:val="111827"/>
+          <w:sz w:val="18"/>
+        </w:rPr>
+        <w:t xml:space="preserve">• </w:t>
+      </w:r>
+      <w:r>
+        <w:rPr>
+          <w:rFonts w:ascii="Calibri" w:hAnsi="Calibri"/>
+          <w:b/>
+          <w:color w:val="111827"/>
           <w:sz w:val="18"/>
         </w:rPr>
         <w:t xml:space="preserve">Optimización de procesos operativos:</w:t>
@@ -840,7 +879,7 @@
       <w:r>
         <w:rPr>
           <w:rFonts w:ascii="Calibri" w:hAnsi="Calibri"/>
-          <w:color w:val="1A202C"/>
+          <w:color w:val="111827"/>
           <w:sz w:val="18"/>
         </w:rPr>
         <w:t xml:space="preserve"> Articulación y coordinación con despachos, operaciones y seguridad patrimonial, estableciendo protocolos de alerta temprana basados en evidencia analítica.</w:t>
@@ -865,16 +904,16 @@
           </w:tcPr>
           <w:p>
             <w:pPr>
-              <w:spacing w:before="60" w:after="20"/>
+              <w:spacing w:before="60" w:after="10"/>
             </w:pPr>
             <w:r>
               <w:rPr>
                 <w:rFonts w:ascii="Calibri" w:hAnsi="Calibri"/>
                 <w:b/>
-                <w:color w:val="1A202C"/>
+                <w:color w:val="111827"/>
                 <w:sz w:val="21"/>
               </w:rPr>
-              <w:t>Sector Bancario — Operaciones Internacionales &amp; Finanzas Corporativas | Caracas, Venezuela</w:t>
+              <w:t>Sector Bancario &amp; Financiero (BFC / Banco Exterior / BVC)</w:t>
             </w:r>
           </w:p>
         </w:tc>
@@ -885,13 +924,54 @@
           <w:p>
             <w:pPr>
               <w:jc w:val="right"/>
-              <w:spacing w:before="60" w:after="20"/>
+              <w:spacing w:before="60" w:after="10"/>
+            </w:pPr>
+            <w:r>
+              <w:rPr>
+                <w:rFonts w:ascii="Calibri" w:hAnsi="Calibri"/>
+                <w:b/>
+                <w:color w:val="111827"/>
+                <w:sz w:val="20"/>
+              </w:rPr>
+              <w:t>Caracas, Venezuela</w:t>
+            </w:r>
+          </w:p>
+        </w:tc>
+      </w:tr>
+      <w:tr>
+        <w:tc>
+          <w:tcPr>
+            <w:tcW w:w="7200" w:type="dxa"/>
+          </w:tcPr>
+          <w:p>
+            <w:pPr>
+              <w:spacing w:before="0" w:after="25"/>
             </w:pPr>
             <w:r>
               <w:rPr>
                 <w:rFonts w:ascii="Calibri" w:hAnsi="Calibri"/>
                 <w:i/>
-                <w:color w:val="4A5568"/>
+                <w:color w:val="1E3A8A"/>
+                <w:sz w:val="19"/>
+              </w:rPr>
+              <w:t>Especialista en Comercio Exterior, Operaciones y Finanzas Corporativas</w:t>
+            </w:r>
+          </w:p>
+        </w:tc>
+        <w:tc>
+          <w:tcPr>
+            <w:tcW w:w="2800" w:type="dxa"/>
+          </w:tcPr>
+          <w:p>
+            <w:pPr>
+              <w:jc w:val="right"/>
+              <w:spacing w:before="0" w:after="25"/>
+            </w:pPr>
+            <w:r>
+              <w:rPr>
+                <w:rFonts w:ascii="Calibri" w:hAnsi="Calibri"/>
+                <w:i/>
+                <w:color w:val="4B5563"/>
                 <w:sz w:val="19"/>
               </w:rPr>
               <w:t>2002 – 2017</w:t>
@@ -902,36 +982,22 @@
     </w:tbl>
     <w:p>
       <w:pPr>
-        <w:spacing w:before="0" w:after="30"/>
-      </w:pPr>
-      <w:r>
-        <w:rPr>
-          <w:rFonts w:ascii="Calibri" w:hAnsi="Calibri"/>
-          <w:b/>
-          <w:color w:val="2B6CB0"/>
-          <w:sz w:val="19"/>
-        </w:rPr>
-        <w:t xml:space="preserve">Especialista de Comercio Exterior (BFC Banco Fondo Común) | Analista de Operaciones Internacionales (Banco Exterior) | Analista de Compras &amp; Representante de Ventas (Venezolano de Crédito S.A.)</w:t>
-      </w:r>
-    </w:p>
-    <w:p>
-      <w:pPr>
         <w:spacing w:before="0" w:after="20"/>
         <w:ind w:left="360" w:hanging="240"/>
       </w:pPr>
       <w:r>
         <w:rPr>
           <w:rFonts w:ascii="Calibri" w:hAnsi="Calibri"/>
-          <w:color w:val="1A202C"/>
-          <w:sz w:val="18"/>
-        </w:rPr>
-        <w:t xml:space="preserve">• </w:t>
-      </w:r>
-      <w:r>
-        <w:rPr>
-          <w:rFonts w:ascii="Calibri" w:hAnsi="Calibri"/>
-          <w:b/>
-          <w:color w:val="1A202C"/>
+          <w:color w:val="111827"/>
+          <w:sz w:val="18"/>
+        </w:rPr>
+        <w:t xml:space="preserve">• </w:t>
+      </w:r>
+      <w:r>
+        <w:rPr>
+          <w:rFonts w:ascii="Calibri" w:hAnsi="Calibri"/>
+          <w:b/>
+          <w:color w:val="111827"/>
           <w:sz w:val="18"/>
         </w:rPr>
         <w:t xml:space="preserve">Comercio Exterior y Operaciones Internacionales (BFC / Banco Exterior):</w:t>
@@ -939,7 +1005,7 @@
       <w:r>
         <w:rPr>
           <w:rFonts w:ascii="Calibri" w:hAnsi="Calibri"/>
-          <w:color w:val="1A202C"/>
+          <w:color w:val="111827"/>
           <w:sz w:val="18"/>
         </w:rPr>
         <w:t xml:space="preserve"> Gestión integral de importaciones, cartas de crédito comerciales, cobranzas documentarias, liquidación de divisas y estricta trazabilidad de fondos.</w:t>
@@ -953,16 +1019,16 @@
       <w:r>
         <w:rPr>
           <w:rFonts w:ascii="Calibri" w:hAnsi="Calibri"/>
-          <w:color w:val="1A202C"/>
-          <w:sz w:val="18"/>
-        </w:rPr>
-        <w:t xml:space="preserve">• </w:t>
-      </w:r>
-      <w:r>
-        <w:rPr>
-          <w:rFonts w:ascii="Calibri" w:hAnsi="Calibri"/>
-          <w:b/>
-          <w:color w:val="1A202C"/>
+          <w:color w:val="111827"/>
+          <w:sz w:val="18"/>
+        </w:rPr>
+        <w:t xml:space="preserve">• </w:t>
+      </w:r>
+      <w:r>
+        <w:rPr>
+          <w:rFonts w:ascii="Calibri" w:hAnsi="Calibri"/>
+          <w:b/>
+          <w:color w:val="111827"/>
           <w:sz w:val="18"/>
         </w:rPr>
         <w:t xml:space="preserve">Control analítico, conciliaciones y auditoría:</w:t>
@@ -970,7 +1036,7 @@
       <w:r>
         <w:rPr>
           <w:rFonts w:ascii="Calibri" w:hAnsi="Calibri"/>
-          <w:color w:val="1A202C"/>
+          <w:color w:val="111827"/>
           <w:sz w:val="18"/>
         </w:rPr>
         <w:t xml:space="preserve"> Supervisión de auxiliares contables, conciliaciones bancarias y auditoría de datos financieros bajo riguroso cumplimiento normativo y regulatorio.</w:t>
@@ -978,22 +1044,22 @@
     </w:p>
     <w:p>
       <w:pPr>
-        <w:spacing w:before="0" w:after="60"/>
-        <w:ind w:left="360" w:hanging="240"/>
-      </w:pPr>
-      <w:r>
-        <w:rPr>
-          <w:rFonts w:ascii="Calibri" w:hAnsi="Calibri"/>
-          <w:color w:val="1A202C"/>
-          <w:sz w:val="18"/>
-        </w:rPr>
-        <w:t xml:space="preserve">• </w:t>
-      </w:r>
-      <w:r>
-        <w:rPr>
-          <w:rFonts w:ascii="Calibri" w:hAnsi="Calibri"/>
-          <w:b/>
-          <w:color w:val="1A202C"/>
+        <w:spacing w:before="0" w:after="50"/>
+        <w:ind w:left="360" w:hanging="240"/>
+      </w:pPr>
+      <w:r>
+        <w:rPr>
+          <w:rFonts w:ascii="Calibri" w:hAnsi="Calibri"/>
+          <w:color w:val="111827"/>
+          <w:sz w:val="18"/>
+        </w:rPr>
+        <w:t xml:space="preserve">• </w:t>
+      </w:r>
+      <w:r>
+        <w:rPr>
+          <w:rFonts w:ascii="Calibri" w:hAnsi="Calibri"/>
+          <w:b/>
+          <w:color w:val="111827"/>
           <w:sz w:val="18"/>
         </w:rPr>
         <w:t xml:space="preserve">Compras, gestión comercial y caja (Venezolano de Crédito S.A.):</w:t>
@@ -1001,7 +1067,7 @@
       <w:r>
         <w:rPr>
           <w:rFonts w:ascii="Calibri" w:hAnsi="Calibri"/>
-          <w:color w:val="1A202C"/>
+          <w:color w:val="111827"/>
           <w:sz w:val="18"/>
         </w:rPr>
         <w:t xml:space="preserve"> Manejo de presupuestos y adquisición de activos operativos para el funcionamiento del banco; operaciones de caja, fidelización y cumplimiento de metas comerciales.</w:t>
@@ -1011,14 +1077,14 @@
       <w:pPr>
         <w:spacing w:before="140" w:after="40"/>
         <w:pBdr>
-          <w:bottom w:val="single" w:sz="6" w:space="1" w:color="1A365D"/>
+          <w:bottom w:val="single" w:sz="6" w:space="1" w:color="0F172A"/>
         </w:pBdr>
       </w:pPr>
       <w:r>
         <w:rPr>
           <w:rFonts w:ascii="Calibri" w:hAnsi="Calibri"/>
           <w:b/>
-          <w:color w:val="1A365D"/>
+          <w:color w:val="0F172A"/>
           <w:sz w:val="24"/>
         </w:rPr>
         <w:t>PROYECTOS DESTACADOS DE ANÁLISIS DE DATOS</w:t>
@@ -1032,16 +1098,16 @@
       <w:r>
         <w:rPr>
           <w:rFonts w:ascii="Calibri" w:hAnsi="Calibri"/>
-          <w:color w:val="1A202C"/>
-          <w:sz w:val="18"/>
-        </w:rPr>
-        <w:t xml:space="preserve">• </w:t>
-      </w:r>
-      <w:r>
-        <w:rPr>
-          <w:rFonts w:ascii="Calibri" w:hAnsi="Calibri"/>
-          <w:b/>
-          <w:color w:val="1A202C"/>
+          <w:color w:val="111827"/>
+          <w:sz w:val="18"/>
+        </w:rPr>
+        <w:t xml:space="preserve">• </w:t>
+      </w:r>
+      <w:r>
+        <w:rPr>
+          <w:rFonts w:ascii="Calibri" w:hAnsi="Calibri"/>
+          <w:b/>
+          <w:color w:val="111827"/>
           <w:sz w:val="18"/>
         </w:rPr>
         <w:t xml:space="preserve">Mate-Mático – Analítica Digital &amp; Producto (Innova Lab):</w:t>
@@ -1049,7 +1115,7 @@
       <w:r>
         <w:rPr>
           <w:rFonts w:ascii="Calibri" w:hAnsi="Calibri"/>
-          <w:color w:val="1A202C"/>
+          <w:color w:val="111827"/>
           <w:sz w:val="18"/>
         </w:rPr>
         <w:t xml:space="preserve"> Implementación integral de tracking con GTM y GA4, persistencia de eventos en Supabase (PostgreSQL) y dashboard en Looker Studio para optimización del embudo de retención y engagement. (github.com/rubenbarrios-bigdata/Analitica-Digital-Mate-matico)</w:t>
@@ -1063,16 +1129,16 @@
       <w:r>
         <w:rPr>
           <w:rFonts w:ascii="Calibri" w:hAnsi="Calibri"/>
-          <w:color w:val="1A202C"/>
-          <w:sz w:val="18"/>
-        </w:rPr>
-        <w:t xml:space="preserve">• </w:t>
-      </w:r>
-      <w:r>
-        <w:rPr>
-          <w:rFonts w:ascii="Calibri" w:hAnsi="Calibri"/>
-          <w:b/>
-          <w:color w:val="1A202C"/>
+          <w:color w:val="111827"/>
+          <w:sz w:val="18"/>
+        </w:rPr>
+        <w:t xml:space="preserve">• </w:t>
+      </w:r>
+      <w:r>
+        <w:rPr>
+          <w:rFonts w:ascii="Calibri" w:hAnsi="Calibri"/>
+          <w:b/>
+          <w:color w:val="111827"/>
           <w:sz w:val="18"/>
         </w:rPr>
         <w:t xml:space="preserve">Dashboard Atención al Cliente (Power BI + DAX):</w:t>
@@ -1080,7 +1146,7 @@
       <w:r>
         <w:rPr>
           <w:rFonts w:ascii="Calibri" w:hAnsi="Calibri"/>
-          <w:color w:val="1A202C"/>
+          <w:color w:val="111827"/>
           <w:sz w:val="18"/>
         </w:rPr>
         <w:t xml:space="preserve"> Tablero interactivo para optimización de operaciones de servicio al cliente: seguimiento de volumen de tickets, tiempos de primera respuesta, SLA de resolución y métricas operativas con medidas y cálculos en DAX. (github.com/rubenbarrios-bigdata/dashboard-atencion-al-cliente)</w:t>
@@ -1094,16 +1160,16 @@
       <w:r>
         <w:rPr>
           <w:rFonts w:ascii="Calibri" w:hAnsi="Calibri"/>
-          <w:color w:val="1A202C"/>
-          <w:sz w:val="18"/>
-        </w:rPr>
-        <w:t xml:space="preserve">• </w:t>
-      </w:r>
-      <w:r>
-        <w:rPr>
-          <w:rFonts w:ascii="Calibri" w:hAnsi="Calibri"/>
-          <w:b/>
-          <w:color w:val="1A202C"/>
+          <w:color w:val="111827"/>
+          <w:sz w:val="18"/>
+        </w:rPr>
+        <w:t xml:space="preserve">• </w:t>
+      </w:r>
+      <w:r>
+        <w:rPr>
+          <w:rFonts w:ascii="Calibri" w:hAnsi="Calibri"/>
+          <w:b/>
+          <w:color w:val="111827"/>
           <w:sz w:val="18"/>
         </w:rPr>
         <w:t xml:space="preserve">Dashboard Reporte de RRHH (Power BI + DAX):</w:t>
@@ -1111,7 +1177,7 @@
       <w:r>
         <w:rPr>
           <w:rFonts w:ascii="Calibri" w:hAnsi="Calibri"/>
-          <w:color w:val="1A202C"/>
+          <w:color w:val="111827"/>
           <w:sz w:val="18"/>
         </w:rPr>
         <w:t xml:space="preserve"> Análisis integral de headcount, métricas de rotación voluntaria/involuntaria (turnover), distribución demográfica y evolución de desempeño para People Analytics. (github.com/rubenbarrios-bigdata/dashboard-rrhh)</w:t>
@@ -1125,16 +1191,16 @@
       <w:r>
         <w:rPr>
           <w:rFonts w:ascii="Calibri" w:hAnsi="Calibri"/>
-          <w:color w:val="1A202C"/>
-          <w:sz w:val="18"/>
-        </w:rPr>
-        <w:t xml:space="preserve">• </w:t>
-      </w:r>
-      <w:r>
-        <w:rPr>
-          <w:rFonts w:ascii="Calibri" w:hAnsi="Calibri"/>
-          <w:b/>
-          <w:color w:val="1A202C"/>
+          <w:color w:val="111827"/>
+          <w:sz w:val="18"/>
+        </w:rPr>
+        <w:t xml:space="preserve">• </w:t>
+      </w:r>
+      <w:r>
+        <w:rPr>
+          <w:rFonts w:ascii="Calibri" w:hAnsi="Calibri"/>
+          <w:b/>
+          <w:color w:val="111827"/>
           <w:sz w:val="18"/>
         </w:rPr>
         <w:t xml:space="preserve">Proyecto SQL Orders &amp; E-Commerce Analysis:</w:t>
@@ -1142,7 +1208,7 @@
       <w:r>
         <w:rPr>
           <w:rFonts w:ascii="Calibri" w:hAnsi="Calibri"/>
-          <w:color w:val="1A202C"/>
+          <w:color w:val="111827"/>
           <w:sz w:val="18"/>
         </w:rPr>
         <w:t xml:space="preserve"> Análisis exploratorio y transaccional sobre datasets de ventas reales en MySQL empleando subqueries, agrupaciones y funciones de agregación para evaluación de métricas comerciales y márgenes de rentabilidad. (github.com/rubenbarrios-bigdata/proyecto-sql-orders)</w:t>
@@ -1156,16 +1222,16 @@
       <w:r>
         <w:rPr>
           <w:rFonts w:ascii="Calibri" w:hAnsi="Calibri"/>
-          <w:color w:val="1A202C"/>
-          <w:sz w:val="18"/>
-        </w:rPr>
-        <w:t xml:space="preserve">• </w:t>
-      </w:r>
-      <w:r>
-        <w:rPr>
-          <w:rFonts w:ascii="Calibri" w:hAnsi="Calibri"/>
-          <w:b/>
-          <w:color w:val="1A202C"/>
+          <w:color w:val="111827"/>
+          <w:sz w:val="18"/>
+        </w:rPr>
+        <w:t xml:space="preserve">• </w:t>
+      </w:r>
+      <w:r>
+        <w:rPr>
+          <w:rFonts w:ascii="Calibri" w:hAnsi="Calibri"/>
+          <w:b/>
+          <w:color w:val="111827"/>
           <w:sz w:val="18"/>
         </w:rPr>
         <w:t xml:space="preserve">Análisis Exploratorio de Datos (EDA) en Python:</w:t>
@@ -1173,7 +1239,7 @@
       <w:r>
         <w:rPr>
           <w:rFonts w:ascii="Calibri" w:hAnsi="Calibri"/>
-          <w:color w:val="1A202C"/>
+          <w:color w:val="111827"/>
           <w:sz w:val="18"/>
         </w:rPr>
         <w:t xml:space="preserve"> Limpieza de datos, manejo de outliers y análisis estadístico multivariado con pandas, NumPy y Matplotlib sobre datasets a escala.</w:t>
@@ -1181,13 +1247,13 @@
     </w:p>
     <w:p>
       <w:pPr>
-        <w:spacing w:before="0" w:after="60"/>
+        <w:spacing w:before="0" w:after="50"/>
       </w:pPr>
       <w:r>
         <w:rPr>
           <w:rFonts w:ascii="Calibri" w:hAnsi="Calibri"/>
           <w:i/>
-          <w:color w:val="2B6CB0"/>
+          <w:color w:val="1D4ED8"/>
           <w:sz w:val="18"/>
         </w:rPr>
         <w:t xml:space="preserve">Todos los proyectos, modelos de datos y documentación técnica disponibles en: github.com/rubenbarrios-bigdata</w:t>
@@ -1197,17 +1263,17 @@
       <w:pPr>
         <w:spacing w:before="140" w:after="40"/>
         <w:pBdr>
-          <w:bottom w:val="single" w:sz="6" w:space="1" w:color="1A365D"/>
+          <w:bottom w:val="single" w:sz="6" w:space="1" w:color="0F172A"/>
         </w:pBdr>
       </w:pPr>
       <w:r>
         <w:rPr>
           <w:rFonts w:ascii="Calibri" w:hAnsi="Calibri"/>
           <w:b/>
-          <w:color w:val="1A365D"/>
+          <w:color w:val="0F172A"/>
           <w:sz w:val="24"/>
         </w:rPr>
-        <w:t>EDUCACIÓN</w:t>
+        <w:t>EDUCACIÓN Y FORMACIÓN</w:t>
       </w:r>
     </w:p>
     <w:p>
@@ -1218,16 +1284,16 @@
       <w:r>
         <w:rPr>
           <w:rFonts w:ascii="Calibri" w:hAnsi="Calibri"/>
-          <w:color w:val="1A202C"/>
-          <w:sz w:val="18"/>
-        </w:rPr>
-        <w:t xml:space="preserve">• </w:t>
-      </w:r>
-      <w:r>
-        <w:rPr>
-          <w:rFonts w:ascii="Calibri" w:hAnsi="Calibri"/>
-          <w:b/>
-          <w:color w:val="1A202C"/>
+          <w:color w:val="111827"/>
+          <w:sz w:val="18"/>
+        </w:rPr>
+        <w:t xml:space="preserve">• </w:t>
+      </w:r>
+      <w:r>
+        <w:rPr>
+          <w:rFonts w:ascii="Calibri" w:hAnsi="Calibri"/>
+          <w:b/>
+          <w:color w:val="111827"/>
           <w:sz w:val="18"/>
         </w:rPr>
         <w:t xml:space="preserve">Tecnicatura Superior en Ciencia de Datos e Inteligencia Artificial</w:t>
@@ -1235,7 +1301,7 @@
       <w:r>
         <w:rPr>
           <w:rFonts w:ascii="Calibri" w:hAnsi="Calibri"/>
-          <w:color w:val="1A202C"/>
+          <w:color w:val="111827"/>
           <w:sz w:val="18"/>
         </w:rPr>
         <w:t xml:space="preserve"> — En curso (Primer Año) — Instituto de Formación Técnica Superior | Ministerio de Educación GCBA</w:t>
@@ -1249,16 +1315,16 @@
       <w:r>
         <w:rPr>
           <w:rFonts w:ascii="Calibri" w:hAnsi="Calibri"/>
-          <w:color w:val="1A202C"/>
-          <w:sz w:val="18"/>
-        </w:rPr>
-        <w:t xml:space="preserve">• </w:t>
-      </w:r>
-      <w:r>
-        <w:rPr>
-          <w:rFonts w:ascii="Calibri" w:hAnsi="Calibri"/>
-          <w:b/>
-          <w:color w:val="1A202C"/>
+          <w:color w:val="111827"/>
+          <w:sz w:val="18"/>
+        </w:rPr>
+        <w:t xml:space="preserve">• </w:t>
+      </w:r>
+      <w:r>
+        <w:rPr>
+          <w:rFonts w:ascii="Calibri" w:hAnsi="Calibri"/>
+          <w:b/>
+          <w:color w:val="111827"/>
           <w:sz w:val="18"/>
         </w:rPr>
         <w:t xml:space="preserve">Business Intelligence (BI Consulting)</w:t>
@@ -1266,7 +1332,7 @@
       <w:r>
         <w:rPr>
           <w:rFonts w:ascii="Calibri" w:hAnsi="Calibri"/>
-          <w:color w:val="1A202C"/>
+          <w:color w:val="111827"/>
           <w:sz w:val="18"/>
         </w:rPr>
         <w:t xml:space="preserve"> — En curso (Segundo cuatrimestre de tres, ruta formativa oficial hacia Análisis de Datos) — Talento Tech | Ministerio de Educación GCBA</w:t>
@@ -1280,16 +1346,16 @@
       <w:r>
         <w:rPr>
           <w:rFonts w:ascii="Calibri" w:hAnsi="Calibri"/>
-          <w:color w:val="1A202C"/>
-          <w:sz w:val="18"/>
-        </w:rPr>
-        <w:t xml:space="preserve">• </w:t>
-      </w:r>
-      <w:r>
-        <w:rPr>
-          <w:rFonts w:ascii="Calibri" w:hAnsi="Calibri"/>
-          <w:b/>
-          <w:color w:val="1A202C"/>
+          <w:color w:val="111827"/>
+          <w:sz w:val="18"/>
+        </w:rPr>
+        <w:t xml:space="preserve">• </w:t>
+      </w:r>
+      <w:r>
+        <w:rPr>
+          <w:rFonts w:ascii="Calibri" w:hAnsi="Calibri"/>
+          <w:b/>
+          <w:color w:val="111827"/>
           <w:sz w:val="18"/>
         </w:rPr>
         <w:t xml:space="preserve">Power BI DevOps: PBIP, Git, CI/CD y Microsoft Fabric</w:t>
@@ -1297,7 +1363,7 @@
       <w:r>
         <w:rPr>
           <w:rFonts w:ascii="Calibri" w:hAnsi="Calibri"/>
-          <w:color w:val="1A202C"/>
+          <w:color w:val="111827"/>
           <w:sz w:val="18"/>
         </w:rPr>
         <w:t xml:space="preserve"> — En curso — Udemy</w:t>
@@ -1311,16 +1377,16 @@
       <w:r>
         <w:rPr>
           <w:rFonts w:ascii="Calibri" w:hAnsi="Calibri"/>
-          <w:color w:val="1A202C"/>
-          <w:sz w:val="18"/>
-        </w:rPr>
-        <w:t xml:space="preserve">• </w:t>
-      </w:r>
-      <w:r>
-        <w:rPr>
-          <w:rFonts w:ascii="Calibri" w:hAnsi="Calibri"/>
-          <w:b/>
-          <w:color w:val="1A202C"/>
+          <w:color w:val="111827"/>
+          <w:sz w:val="18"/>
+        </w:rPr>
+        <w:t xml:space="preserve">• </w:t>
+      </w:r>
+      <w:r>
+        <w:rPr>
+          <w:rFonts w:ascii="Calibri" w:hAnsi="Calibri"/>
+          <w:b/>
+          <w:color w:val="111827"/>
           <w:sz w:val="18"/>
         </w:rPr>
         <w:t xml:space="preserve">Licenciatura en Administración de Recursos Materiales y Financieros</w:t>
@@ -1328,7 +1394,7 @@
       <w:r>
         <w:rPr>
           <w:rFonts w:ascii="Calibri" w:hAnsi="Calibri"/>
-          <w:color w:val="1A202C"/>
+          <w:color w:val="111827"/>
           <w:sz w:val="18"/>
         </w:rPr>
         <w:t xml:space="preserve"> — Universidad Nacional Experimental Simón Rodríguez | Caracas, Venezuela</w:t>
@@ -1336,22 +1402,22 @@
     </w:p>
     <w:p>
       <w:pPr>
-        <w:spacing w:before="0" w:after="60"/>
-        <w:ind w:left="360" w:hanging="240"/>
-      </w:pPr>
-      <w:r>
-        <w:rPr>
-          <w:rFonts w:ascii="Calibri" w:hAnsi="Calibri"/>
-          <w:color w:val="1A202C"/>
-          <w:sz w:val="18"/>
-        </w:rPr>
-        <w:t xml:space="preserve">• </w:t>
-      </w:r>
-      <w:r>
-        <w:rPr>
-          <w:rFonts w:ascii="Calibri" w:hAnsi="Calibri"/>
-          <w:b/>
-          <w:color w:val="1A202C"/>
+        <w:spacing w:before="0" w:after="50"/>
+        <w:ind w:left="360" w:hanging="240"/>
+      </w:pPr>
+      <w:r>
+        <w:rPr>
+          <w:rFonts w:ascii="Calibri" w:hAnsi="Calibri"/>
+          <w:color w:val="111827"/>
+          <w:sz w:val="18"/>
+        </w:rPr>
+        <w:t xml:space="preserve">• </w:t>
+      </w:r>
+      <w:r>
+        <w:rPr>
+          <w:rFonts w:ascii="Calibri" w:hAnsi="Calibri"/>
+          <w:b/>
+          <w:color w:val="111827"/>
           <w:sz w:val="18"/>
         </w:rPr>
         <w:t xml:space="preserve">T.S.U. en Administración de Recursos Físicos y Financieros</w:t>
@@ -1359,7 +1425,7 @@
       <w:r>
         <w:rPr>
           <w:rFonts w:ascii="Calibri" w:hAnsi="Calibri"/>
-          <w:color w:val="1A202C"/>
+          <w:color w:val="111827"/>
           <w:sz w:val="18"/>
         </w:rPr>
         <w:t xml:space="preserve"> — Colegio Universitario Fermín Toro | Caracas, Venezuela</w:t>
@@ -1369,17 +1435,17 @@
       <w:pPr>
         <w:spacing w:before="140" w:after="40"/>
         <w:pBdr>
-          <w:bottom w:val="single" w:sz="6" w:space="1" w:color="1A365D"/>
+          <w:bottom w:val="single" w:sz="6" w:space="1" w:color="0F172A"/>
         </w:pBdr>
       </w:pPr>
       <w:r>
         <w:rPr>
           <w:rFonts w:ascii="Calibri" w:hAnsi="Calibri"/>
           <w:b/>
-          <w:color w:val="1A365D"/>
+          <w:color w:val="0F172A"/>
           <w:sz w:val="24"/>
         </w:rPr>
-        <w:t>CERTIFICADOS EXTRACURRICULARES</w:t>
+        <w:t>CERTIFICACIONES</w:t>
       </w:r>
     </w:p>
     <w:p>
@@ -1390,16 +1456,16 @@
       <w:r>
         <w:rPr>
           <w:rFonts w:ascii="Calibri" w:hAnsi="Calibri"/>
-          <w:color w:val="1A202C"/>
-          <w:sz w:val="18"/>
-        </w:rPr>
-        <w:t xml:space="preserve">• </w:t>
-      </w:r>
-      <w:r>
-        <w:rPr>
-          <w:rFonts w:ascii="Calibri" w:hAnsi="Calibri"/>
-          <w:b/>
-          <w:color w:val="1A202C"/>
+          <w:color w:val="111827"/>
+          <w:sz w:val="18"/>
+        </w:rPr>
+        <w:t xml:space="preserve">• </w:t>
+      </w:r>
+      <w:r>
+        <w:rPr>
+          <w:rFonts w:ascii="Calibri" w:hAnsi="Calibri"/>
+          <w:b/>
+          <w:color w:val="111827"/>
           <w:sz w:val="18"/>
         </w:rPr>
         <w:t xml:space="preserve">Analítica Digital: Google Tag Manager, Google Analytics 4 y Data Studio</w:t>
@@ -1407,7 +1473,7 @@
       <w:r>
         <w:rPr>
           <w:rFonts w:ascii="Calibri" w:hAnsi="Calibri"/>
-          <w:color w:val="1A202C"/>
+          <w:color w:val="111827"/>
           <w:sz w:val="18"/>
         </w:rPr>
         <w:t xml:space="preserve"> | Analytics Way</w:t>
@@ -1421,16 +1487,16 @@
       <w:r>
         <w:rPr>
           <w:rFonts w:ascii="Calibri" w:hAnsi="Calibri"/>
-          <w:color w:val="1A202C"/>
-          <w:sz w:val="18"/>
-        </w:rPr>
-        <w:t xml:space="preserve">• </w:t>
-      </w:r>
-      <w:r>
-        <w:rPr>
-          <w:rFonts w:ascii="Calibri" w:hAnsi="Calibri"/>
-          <w:b/>
-          <w:color w:val="1A202C"/>
+          <w:color w:val="111827"/>
+          <w:sz w:val="18"/>
+        </w:rPr>
+        <w:t xml:space="preserve">• </w:t>
+      </w:r>
+      <w:r>
+        <w:rPr>
+          <w:rFonts w:ascii="Calibri" w:hAnsi="Calibri"/>
+          <w:b/>
+          <w:color w:val="111827"/>
           <w:sz w:val="18"/>
         </w:rPr>
         <w:t xml:space="preserve">Análisis de Datos: Excel, Power BI, SQL y Python</w:t>
@@ -1438,7 +1504,7 @@
       <w:r>
         <w:rPr>
           <w:rFonts w:ascii="Calibri" w:hAnsi="Calibri"/>
-          <w:color w:val="1A202C"/>
+          <w:color w:val="111827"/>
           <w:sz w:val="18"/>
         </w:rPr>
         <w:t xml:space="preserve"> | Datax</w:t>
@@ -1452,16 +1518,16 @@
       <w:r>
         <w:rPr>
           <w:rFonts w:ascii="Calibri" w:hAnsi="Calibri"/>
-          <w:color w:val="1A202C"/>
-          <w:sz w:val="18"/>
-        </w:rPr>
-        <w:t xml:space="preserve">• </w:t>
-      </w:r>
-      <w:r>
-        <w:rPr>
-          <w:rFonts w:ascii="Calibri" w:hAnsi="Calibri"/>
-          <w:b/>
-          <w:color w:val="1A202C"/>
+          <w:color w:val="111827"/>
+          <w:sz w:val="18"/>
+        </w:rPr>
+        <w:t xml:space="preserve">• </w:t>
+      </w:r>
+      <w:r>
+        <w:rPr>
+          <w:rFonts w:ascii="Calibri" w:hAnsi="Calibri"/>
+          <w:b/>
+          <w:color w:val="111827"/>
           <w:sz w:val="18"/>
         </w:rPr>
         <w:t xml:space="preserve">Fundamentos de Inteligencia Artificial (Artificial Intelligence Fundamentals)</w:t>
@@ -1469,7 +1535,7 @@
       <w:r>
         <w:rPr>
           <w:rFonts w:ascii="Calibri" w:hAnsi="Calibri"/>
-          <w:color w:val="1A202C"/>
+          <w:color w:val="111827"/>
           <w:sz w:val="18"/>
         </w:rPr>
         <w:t xml:space="preserve"> | IBM SkillsBuild</w:t>
@@ -1483,16 +1549,16 @@
       <w:r>
         <w:rPr>
           <w:rFonts w:ascii="Calibri" w:hAnsi="Calibri"/>
-          <w:color w:val="1A202C"/>
-          <w:sz w:val="18"/>
-        </w:rPr>
-        <w:t xml:space="preserve">• </w:t>
-      </w:r>
-      <w:r>
-        <w:rPr>
-          <w:rFonts w:ascii="Calibri" w:hAnsi="Calibri"/>
-          <w:b/>
-          <w:color w:val="1A202C"/>
+          <w:color w:val="111827"/>
+          <w:sz w:val="18"/>
+        </w:rPr>
+        <w:t xml:space="preserve">• </w:t>
+      </w:r>
+      <w:r>
+        <w:rPr>
+          <w:rFonts w:ascii="Calibri" w:hAnsi="Calibri"/>
+          <w:b/>
+          <w:color w:val="111827"/>
           <w:sz w:val="18"/>
         </w:rPr>
         <w:t xml:space="preserve">Iniciación a la Programación con Python</w:t>
@@ -1500,7 +1566,7 @@
       <w:r>
         <w:rPr>
           <w:rFonts w:ascii="Calibri" w:hAnsi="Calibri"/>
-          <w:color w:val="1A202C"/>
+          <w:color w:val="111827"/>
           <w:sz w:val="18"/>
         </w:rPr>
         <w:t xml:space="preserve"> | Talento Tech — Ministerio de Educación GCBA</w:t>
@@ -1508,33 +1574,128 @@
     </w:p>
     <w:p>
       <w:pPr>
+        <w:spacing w:before="0" w:after="35"/>
+        <w:ind w:left="360" w:hanging="240"/>
+      </w:pPr>
+      <w:r>
+        <w:rPr>
+          <w:rFonts w:ascii="Calibri" w:hAnsi="Calibri"/>
+          <w:color w:val="111827"/>
+          <w:sz w:val="18"/>
+        </w:rPr>
+        <w:t xml:space="preserve">• </w:t>
+      </w:r>
+      <w:r>
+        <w:rPr>
+          <w:rFonts w:ascii="Calibri" w:hAnsi="Calibri"/>
+          <w:b/>
+          <w:color w:val="111827"/>
+          <w:sz w:val="18"/>
+        </w:rPr>
+        <w:t xml:space="preserve">IA Aplicada al Entorno Laboral: ChatGPT, Gemini, Copilot, Make</w:t>
+      </w:r>
+      <w:r>
+        <w:rPr>
+          <w:rFonts w:ascii="Calibri" w:hAnsi="Calibri"/>
+          <w:color w:val="111827"/>
+          <w:sz w:val="18"/>
+        </w:rPr>
+        <w:t xml:space="preserve"> | Datax</w:t>
+      </w:r>
+    </w:p>
+    <w:p>
+      <w:pPr>
+        <w:spacing w:before="140" w:after="40"/>
+        <w:pBdr>
+          <w:bottom w:val="single" w:sz="6" w:space="1" w:color="0F172A"/>
+        </w:pBdr>
+      </w:pPr>
+      <w:r>
+        <w:rPr>
+          <w:rFonts w:ascii="Calibri" w:hAnsi="Calibri"/>
+          <w:b/>
+          <w:color w:val="0F172A"/>
+          <w:sz w:val="24"/>
+        </w:rPr>
+        <w:t>IDIOMAS</w:t>
+      </w:r>
+    </w:p>
+    <w:p>
+      <w:pPr>
+        <w:spacing w:before="0" w:after="35"/>
+        <w:ind w:left="360" w:hanging="240"/>
+      </w:pPr>
+      <w:r>
+        <w:rPr>
+          <w:rFonts w:ascii="Calibri" w:hAnsi="Calibri"/>
+          <w:color w:val="111827"/>
+          <w:sz w:val="18"/>
+        </w:rPr>
+        <w:t xml:space="preserve">• </w:t>
+      </w:r>
+      <w:r>
+        <w:rPr>
+          <w:rFonts w:ascii="Calibri" w:hAnsi="Calibri"/>
+          <w:b/>
+          <w:color w:val="111827"/>
+          <w:sz w:val="18"/>
+        </w:rPr>
+        <w:t xml:space="preserve">Español:</w:t>
+      </w:r>
+      <w:r>
+        <w:rPr>
+          <w:rFonts w:ascii="Calibri" w:hAnsi="Calibri"/>
+          <w:color w:val="111827"/>
+          <w:sz w:val="18"/>
+        </w:rPr>
+        <w:t xml:space="preserve"> Nativo | </w:t>
+      </w:r>
+      <w:r>
+        <w:rPr>
+          <w:rFonts w:ascii="Calibri" w:hAnsi="Calibri"/>
+          <w:b/>
+          <w:color w:val="111827"/>
+          <w:sz w:val="18"/>
+        </w:rPr>
+        <w:t xml:space="preserve">Inglés:</w:t>
+      </w:r>
+      <w:r>
+        <w:rPr>
+          <w:rFonts w:ascii="Calibri" w:hAnsi="Calibri"/>
+          <w:color w:val="111827"/>
+          <w:sz w:val="18"/>
+        </w:rPr>
+        <w:t xml:space="preserve"> Técnico / Lectura y comprensión profesional de documentación y datos.</w:t>
+      </w:r>
+    </w:p>
+    <w:p>
+      <w:pPr>
+        <w:spacing w:before="140" w:after="40"/>
+        <w:pBdr>
+          <w:bottom w:val="single" w:sz="6" w:space="1" w:color="0F172A"/>
+        </w:pBdr>
+      </w:pPr>
+      <w:r>
+        <w:rPr>
+          <w:rFonts w:ascii="Calibri" w:hAnsi="Calibri"/>
+          <w:b/>
+          <w:color w:val="0F172A"/>
+          <w:sz w:val="24"/>
+        </w:rPr>
+        <w:t>REFERENCIAS</w:t>
+      </w:r>
+    </w:p>
+    <w:p>
+      <w:pPr>
         <w:spacing w:before="0" w:after="30"/>
-        <w:ind w:left="360" w:hanging="240"/>
-      </w:pPr>
-      <w:r>
-        <w:rPr>
-          <w:rFonts w:ascii="Calibri" w:hAnsi="Calibri"/>
-          <w:color w:val="1A202C"/>
-          <w:sz w:val="18"/>
-        </w:rPr>
-        <w:t xml:space="preserve">• </w:t>
-      </w:r>
-      <w:r>
-        <w:rPr>
-          <w:rFonts w:ascii="Calibri" w:hAnsi="Calibri"/>
-          <w:b/>
-          <w:color w:val="1A202C"/>
-          <w:sz w:val="18"/>
-        </w:rPr>
-        <w:t xml:space="preserve">IA Aplicada al Entorno Laboral: ChatGPT, Gemini, Copilot, Make</w:t>
-      </w:r>
-      <w:r>
-        <w:rPr>
-          <w:rFonts w:ascii="Calibri" w:hAnsi="Calibri"/>
-          <w:color w:val="1A202C"/>
-          <w:sz w:val="18"/>
-        </w:rPr>
-        <w:t xml:space="preserve"> | Datax</w:t>
+      </w:pPr>
+      <w:r>
+        <w:rPr>
+          <w:rFonts w:ascii="Calibri" w:hAnsi="Calibri"/>
+          <w:color w:val="111827"/>
+          <w:sz w:val="18"/>
+        </w:rPr>
+        <w:t xml:space="preserve">Referencias laborales y académicas comprobables disponibles a solicitud.</w:t>
       </w:r>
     </w:p>
     <w:sectPr>

</xml_diff>

<commit_message>
fix(ats): eliminar tabla de habilidades y migrar a viñetas lineales continuas 100% optimas para parsers ATS
</commit_message>
<xml_diff>
--- a/CV_Ruben_Barrios_Analista_De_Datos.docx
+++ b/CV_Ruben_Barrios_Analista_De_Datos.docx
@@ -234,7 +234,7 @@
     </w:p>
     <w:p>
       <w:pPr>
-        <w:spacing w:before="0" w:after="25"/>
+        <w:spacing w:before="0" w:after="20"/>
         <w:ind w:left="360" w:hanging="240"/>
       </w:pPr>
       <w:r>
@@ -252,7 +252,7 @@
           <w:color w:val="111827"/>
           <w:sz w:val="19"/>
         </w:rPr>
-        <w:t xml:space="preserve">Análisis de Datos y BI:</w:t>
+        <w:t xml:space="preserve">Análisis de Datos y Business Intelligence:</w:t>
       </w:r>
       <w:r>
         <w:rPr>
@@ -265,7 +265,7 @@
     </w:p>
     <w:p>
       <w:pPr>
-        <w:spacing w:before="0" w:after="25"/>
+        <w:spacing w:before="0" w:after="20"/>
         <w:ind w:left="360" w:hanging="240"/>
       </w:pPr>
       <w:r>
@@ -283,7 +283,7 @@
           <w:color w:val="111827"/>
           <w:sz w:val="19"/>
         </w:rPr>
-        <w:t xml:space="preserve">Visualización y Producto:</w:t>
+        <w:t xml:space="preserve">Visualización y Analítica Digital:</w:t>
       </w:r>
       <w:r>
         <w:rPr>
@@ -296,7 +296,7 @@
     </w:p>
     <w:p>
       <w:pPr>
-        <w:spacing w:before="0" w:after="50"/>
+        <w:spacing w:before="0" w:after="20"/>
         <w:ind w:left="360" w:hanging="240"/>
       </w:pPr>
       <w:r>
@@ -314,7 +314,7 @@
           <w:color w:val="111827"/>
           <w:sz w:val="19"/>
         </w:rPr>
-        <w:t xml:space="preserve">Negocio y Metodologías:</w:t>
+        <w:t xml:space="preserve">Estrategia de Negocio y Fraude:</w:t>
       </w:r>
       <w:r>
         <w:rPr>
@@ -322,7 +322,38 @@
           <w:color w:val="111827"/>
           <w:sz w:val="19"/>
         </w:rPr>
-        <w:t xml:space="preserve"> Prevención de Fraudes, Detección de Anomalías en Logística/E-Commerce, Finanzas Corporativas, Comercio Exterior, Git/GitHub, CI/CD para BI, Scrum/Ágil, IA Generativa aplicada (ChatGPT, Copilot, Gemini, Claude, Make).</w:t>
+        <w:t xml:space="preserve"> Prevención de Fraudes, Detección de Anomalías en Logística/E-Commerce y Última Milla, Finanzas Corporativas, Comercio Exterior, Liquidación Cambiaria y Trazabilidad de Fondos.</w:t>
+      </w:r>
+    </w:p>
+    <w:p>
+      <w:pPr>
+        <w:spacing w:before="0" w:after="40"/>
+        <w:ind w:left="360" w:hanging="240"/>
+      </w:pPr>
+      <w:r>
+        <w:rPr>
+          <w:rFonts w:ascii="Calibri" w:hAnsi="Calibri"/>
+          <w:color w:val="111827"/>
+          <w:sz w:val="19"/>
+        </w:rPr>
+        <w:t xml:space="preserve">• </w:t>
+      </w:r>
+      <w:r>
+        <w:rPr>
+          <w:rFonts w:ascii="Calibri" w:hAnsi="Calibri"/>
+          <w:b/>
+          <w:color w:val="111827"/>
+          <w:sz w:val="19"/>
+        </w:rPr>
+        <w:t xml:space="preserve">Metodologías y Herramientas:</w:t>
+      </w:r>
+      <w:r>
+        <w:rPr>
+          <w:rFonts w:ascii="Calibri" w:hAnsi="Calibri"/>
+          <w:color w:val="111827"/>
+          <w:sz w:val="19"/>
+        </w:rPr>
+        <w:t xml:space="preserve"> Git, GitHub, CI/CD para BI, Scrum/Ágil, IA Generativa aplicada a analítica de datos (ChatGPT, Copilot, Gemini, Claude, Make).</w:t>
       </w:r>
     </w:p>
     <w:p>

</xml_diff>

<commit_message>
fix: actualizar CV web y PDFs (eliminar inglés de idiomas, fórmulas matriciales y referencias; renombrar a CERTIFICADOS; cache bust v=3.0)
</commit_message>
<xml_diff>
--- a/CV_Ruben_Barrios_Analista_De_Datos.docx
+++ b/CV_Ruben_Barrios_Analista_De_Datos.docx
@@ -260,7 +260,7 @@
           <w:color w:val="111827"/>
           <w:sz w:val="19"/>
         </w:rPr>
-        <w:t xml:space="preserve"> Power BI (DAX avanzado, Power Query, modelado dimensional, PBIP), SQL (MySQL, PostgreSQL: queries complejas, subconsultas, agregaciones), Python (pandas, NumPy, Matplotlib, Colab, VSCode), Excel avanzado (tablas dinámicas, fórmulas matriciales).</w:t>
+        <w:t xml:space="preserve"> Power BI (DAX avanzado, Power Query, modelado dimensional, PBIP), SQL (MySQL, PostgreSQL: queries complejas, subconsultas, agregaciones), Python (pandas, NumPy, Matplotlib, Colab, VSCode), Excel avanzado (tablas dinámicas).</w:t>
       </w:r>
     </w:p>
     <w:p>
@@ -1476,7 +1476,7 @@
           <w:color w:val="0F172A"/>
           <w:sz w:val="24"/>
         </w:rPr>
-        <w:t>CERTIFICACIONES</w:t>
+        <w:t>CERTIFICADOS</w:t>
       </w:r>
     </w:p>
     <w:p>
@@ -1679,54 +1679,7 @@
           <w:color w:val="111827"/>
           <w:sz w:val="18"/>
         </w:rPr>
-        <w:t xml:space="preserve"> Nativo | </w:t>
-      </w:r>
-      <w:r>
-        <w:rPr>
-          <w:rFonts w:ascii="Calibri" w:hAnsi="Calibri"/>
-          <w:b/>
-          <w:color w:val="111827"/>
-          <w:sz w:val="18"/>
-        </w:rPr>
-        <w:t xml:space="preserve">Inglés:</w:t>
-      </w:r>
-      <w:r>
-        <w:rPr>
-          <w:rFonts w:ascii="Calibri" w:hAnsi="Calibri"/>
-          <w:color w:val="111827"/>
-          <w:sz w:val="18"/>
-        </w:rPr>
-        <w:t xml:space="preserve"> Técnico / Lectura y comprensión profesional de documentación y datos.</w:t>
-      </w:r>
-    </w:p>
-    <w:p>
-      <w:pPr>
-        <w:spacing w:before="140" w:after="40"/>
-        <w:pBdr>
-          <w:bottom w:val="single" w:sz="6" w:space="1" w:color="0F172A"/>
-        </w:pBdr>
-      </w:pPr>
-      <w:r>
-        <w:rPr>
-          <w:rFonts w:ascii="Calibri" w:hAnsi="Calibri"/>
-          <w:b/>
-          <w:color w:val="0F172A"/>
-          <w:sz w:val="24"/>
-        </w:rPr>
-        <w:t>REFERENCIAS</w:t>
-      </w:r>
-    </w:p>
-    <w:p>
-      <w:pPr>
-        <w:spacing w:before="0" w:after="30"/>
-      </w:pPr>
-      <w:r>
-        <w:rPr>
-          <w:rFonts w:ascii="Calibri" w:hAnsi="Calibri"/>
-          <w:color w:val="111827"/>
-          <w:sz w:val="18"/>
-        </w:rPr>
-        <w:t xml:space="preserve">Referencias laborales y académicas comprobables disponibles a solicitud.</w:t>
+        <w:t xml:space="preserve"> Nativo</w:t>
       </w:r>
     </w:p>
     <w:sectPr>

</xml_diff>

<commit_message>
feat: reordenar herramientas de perfil según pipeline de datos (SQL, Python, Power BI, Excel, Google Sheets) y separar Business Intelligence | Fraud Prevention (v=3.2)
</commit_message>
<xml_diff>
--- a/CV_Ruben_Barrios_Analista_De_Datos.docx
+++ b/CV_Ruben_Barrios_Analista_De_Datos.docx
@@ -113,7 +113,7 @@
           <w:color w:val="111827"/>
           <w:sz w:val="19"/>
         </w:rPr>
-        <w:t xml:space="preserve"> con experiencia comprobada en análisis de métricas de fraude en logística para e-commerce y distribución de última milla (Last-Mile Fulfillment), complementada por más de 15 años de sólida trayectoria en el sector bancario, negocios internacionales y finanzas corporativas. Hoy combino esa visión estratégica con un enfoque resolutivo orientado a transformar requerimientos de negocio en soluciones analíticas de alto impacto mediante el diseño de dashboards en </w:t>
+        <w:t xml:space="preserve"> con experiencia comprobada en análisis de métricas de fraude en logística para e-commerce y distribución de última milla (Last-Mile Fulfillment), complementada por más de 15 años de sólida trayectoria en el sector bancario, negocios internacionales y finanzas corporativas. Hoy combino esa visión estratégica con un enfoque resolutivo orientado a transformar requerimientos de negocio en soluciones analíticas de alto impacto mediante consultas </w:t>
       </w:r>
       <w:r>
         <w:rPr>
@@ -122,7 +122,7 @@
           <w:color w:val="111827"/>
           <w:sz w:val="19"/>
         </w:rPr>
-        <w:t xml:space="preserve">Excel y Power BI</w:t>
+        <w:t xml:space="preserve">SQL (MySQL, PostgreSQL)</w:t>
       </w:r>
       <w:r>
         <w:rPr>
@@ -130,7 +130,7 @@
           <w:color w:val="111827"/>
           <w:sz w:val="19"/>
         </w:rPr>
-        <w:t xml:space="preserve">, consultas </w:t>
+        <w:t xml:space="preserve">, automatización con </w:t>
       </w:r>
       <w:r>
         <w:rPr>
@@ -139,7 +139,7 @@
           <w:color w:val="111827"/>
           <w:sz w:val="19"/>
         </w:rPr>
-        <w:t xml:space="preserve">SQL (MySQL, PostgreSQL)</w:t>
+        <w:t xml:space="preserve">Python (pandas)</w:t>
       </w:r>
       <w:r>
         <w:rPr>
@@ -147,7 +147,7 @@
           <w:color w:val="111827"/>
           <w:sz w:val="19"/>
         </w:rPr>
-        <w:t xml:space="preserve">, automatización con </w:t>
+        <w:t xml:space="preserve">, diseño de dashboards ejecutivos en </w:t>
       </w:r>
       <w:r>
         <w:rPr>
@@ -156,7 +156,7 @@
           <w:color w:val="111827"/>
           <w:sz w:val="19"/>
         </w:rPr>
-        <w:t xml:space="preserve">Python (pandas)</w:t>
+        <w:t xml:space="preserve">Power BI, Excel y Google Sheets</w:t>
       </w:r>
       <w:r>
         <w:rPr>
@@ -164,7 +164,7 @@
           <w:color w:val="111827"/>
           <w:sz w:val="19"/>
         </w:rPr>
-        <w:t xml:space="preserve"> y analítica digital de productos con </w:t>
+        <w:t xml:space="preserve">, y analítica digital de productos con </w:t>
       </w:r>
       <w:r>
         <w:rPr>

</xml_diff>